<commit_message>
Update research paper with paper trading results + dashboard improvements
- Research paper: add sections 11-13 (market matching architecture,
  paper trading results Mar 5-6, testing framework)
- Update parameters to current config (min_edge 3%, max_pos $8, etc.)
- Dashboard: collapsible date groups, sortable headers, search filter
- Dashboard: show all positions (removed 20-item cap)
- MIN_EDGE_PCT raised from 1.5% to 3.0%

Co-Authored-By: Claude Opus 4.6 <noreply@anthropic.com>
</commit_message>
<xml_diff>
--- a/docs/Trading_Logic_and_Edge_Framework.docx
+++ b/docs/Trading_Logic_and_Edge_Framework.docx
@@ -176,6 +176,36 @@
           <w:color w:val="1A3C5E"/>
           <w:sz w:val="22"/>
         </w:rPr>
+        <w:t>11. Market Matching Architecture</w:t>
+      </w:r>
+    </w:p>
+    <w:p>
+      <w:r>
+        <w:rPr>
+          <w:rFonts w:ascii="Garamond" w:hAnsi="Garamond"/>
+          <w:color w:val="1A3C5E"/>
+          <w:sz w:val="22"/>
+        </w:rPr>
+        <w:t>12. Paper Trading Results (March 2026)</w:t>
+      </w:r>
+    </w:p>
+    <w:p>
+      <w:r>
+        <w:rPr>
+          <w:rFonts w:ascii="Garamond" w:hAnsi="Garamond"/>
+          <w:color w:val="1A3C5E"/>
+          <w:sz w:val="22"/>
+        </w:rPr>
+        <w:t>13. Testing &amp; Validation Framework</w:t>
+      </w:r>
+    </w:p>
+    <w:p>
+      <w:r>
+        <w:rPr>
+          <w:rFonts w:ascii="Garamond" w:hAnsi="Garamond"/>
+          <w:color w:val="1A3C5E"/>
+          <w:sz w:val="22"/>
+        </w:rPr>
         <w:t>References</w:t>
       </w:r>
     </w:p>
@@ -226,7 +256,7 @@
           <w:i w:val="0"/>
           <w:sz w:val="22"/>
         </w:rPr>
-        <w:t>The system targets 3-15% edge per trade in the 5-40c price range, uses quarter-Kelly sizing ($500 test bankroll, $25 max position), and holds positions to resolution. Six independent edge sources provide robustness against any single source diminishing.</w:t>
+        <w:t>The system targets 3-15% edge per trade in the 5-95c price range, uses fractional Kelly sizing ($500 test bankroll, $8 max position), and holds positions to resolution. Six independent edge sources provide robustness against any single source diminishing.</w:t>
       </w:r>
     </w:p>
     <w:p>
@@ -414,7 +444,7 @@
                 <w:b w:val="0"/>
                 <w:sz w:val="18"/>
               </w:rPr>
-              <w:t>$25 (5%)</w:t>
+              <w:t>$8 (1.6%)</w:t>
             </w:r>
           </w:p>
         </w:tc>
@@ -434,7 +464,7 @@
                 <w:b w:val="0"/>
                 <w:sz w:val="18"/>
               </w:rPr>
-              <w:t>Conservative single-name limit</w:t>
+              <w:t>Small size for statistical learning phase</w:t>
             </w:r>
           </w:p>
         </w:tc>
@@ -474,7 +504,7 @@
                 <w:b w:val="0"/>
                 <w:sz w:val="18"/>
               </w:rPr>
-              <w:t>$300 (60%)</w:t>
+              <w:t>$400 (80%)</w:t>
             </w:r>
           </w:p>
         </w:tc>
@@ -493,7 +523,7 @@
                 <w:b w:val="0"/>
                 <w:sz w:val="18"/>
               </w:rPr>
-              <w:t>Prevents full drawdown</w:t>
+              <w:t>Maximise capital deployment</w:t>
             </w:r>
           </w:p>
         </w:tc>
@@ -535,7 +565,7 @@
                 <w:b w:val="0"/>
                 <w:sz w:val="18"/>
               </w:rPr>
-              <w:t>0.25 (quarter)</w:t>
+              <w:t>0.15 (fractional)</w:t>
             </w:r>
           </w:p>
         </w:tc>
@@ -555,7 +585,7 @@
                 <w:b w:val="0"/>
                 <w:sz w:val="18"/>
               </w:rPr>
-              <w:t>56% growth, 25% variance</w:t>
+              <w:t>Conservative: 15% of full Kelly</w:t>
             </w:r>
           </w:p>
         </w:tc>
@@ -614,7 +644,7 @@
                 <w:b w:val="0"/>
                 <w:sz w:val="18"/>
               </w:rPr>
-              <w:t>Below this, costs dominate</w:t>
+              <w:t>Below this, transaction costs dominate</w:t>
             </w:r>
           </w:p>
         </w:tc>
@@ -656,7 +686,7 @@
                 <w:b w:val="0"/>
                 <w:sz w:val="18"/>
               </w:rPr>
-              <w:t>25%</w:t>
+              <w:t>20%</w:t>
             </w:r>
           </w:p>
         </w:tc>
@@ -716,7 +746,7 @@
                 <w:b w:val="0"/>
                 <w:sz w:val="18"/>
               </w:rPr>
-              <w:t>3c - 50c</w:t>
+              <w:t>5c - 95c</w:t>
             </w:r>
           </w:p>
         </w:tc>
@@ -735,7 +765,7 @@
                 <w:b w:val="0"/>
                 <w:sz w:val="18"/>
               </w:rPr>
-              <w:t>Highest mispricing zone (RN1 data)</w:t>
+              <w:t>Full range for h2h/spread/total markets</w:t>
             </w:r>
           </w:p>
         </w:tc>
@@ -777,7 +807,7 @@
                 <w:b w:val="0"/>
                 <w:sz w:val="18"/>
               </w:rPr>
-              <w:t>5 days</w:t>
+              <w:t>10 days</w:t>
             </w:r>
           </w:p>
         </w:tc>
@@ -797,7 +827,7 @@
                 <w:b w:val="0"/>
                 <w:sz w:val="18"/>
               </w:rPr>
-              <w:t>Avoid capital lockup</w:t>
+              <w:t>Balance capital lockup vs coverage</w:t>
             </w:r>
           </w:p>
         </w:tc>
@@ -818,6 +848,66 @@
                 <w:b/>
                 <w:sz w:val="18"/>
               </w:rPr>
+              <w:t>Min Liquidity</w:t>
+            </w:r>
+          </w:p>
+        </w:tc>
+        <w:tc>
+          <w:tcPr>
+            <w:tcW w:type="dxa" w:w="3135"/>
+          </w:tcPr>
+          <w:p>
+            <w:pPr>
+              <w:jc w:val="center"/>
+            </w:pPr>
+            <w:r/>
+            <w:r>
+              <w:rPr>
+                <w:rFonts w:ascii="Garamond" w:hAnsi="Garamond"/>
+                <w:b w:val="0"/>
+                <w:sz w:val="18"/>
+              </w:rPr>
+              <w:t>$100</w:t>
+            </w:r>
+          </w:p>
+        </w:tc>
+        <w:tc>
+          <w:tcPr>
+            <w:tcW w:type="dxa" w:w="3135"/>
+          </w:tcPr>
+          <w:p>
+            <w:pPr>
+              <w:jc w:val="left"/>
+            </w:pPr>
+            <w:r/>
+            <w:r>
+              <w:rPr>
+                <w:rFonts w:ascii="Garamond" w:hAnsi="Garamond"/>
+                <w:b w:val="0"/>
+                <w:sz w:val="18"/>
+              </w:rPr>
+              <w:t>Ensures reliable midpoint pricing</w:t>
+            </w:r>
+          </w:p>
+        </w:tc>
+      </w:tr>
+      <w:tr>
+        <w:tc>
+          <w:tcPr>
+            <w:tcW w:type="dxa" w:w="3135"/>
+            <w:shd w:fill="F2F7FB"/>
+          </w:tcPr>
+          <w:p>
+            <w:pPr>
+              <w:jc w:val="left"/>
+            </w:pPr>
+            <w:r/>
+            <w:r>
+              <w:rPr>
+                <w:rFonts w:ascii="Garamond" w:hAnsi="Garamond"/>
+                <w:b/>
+                <w:sz w:val="18"/>
+              </w:rPr>
               <w:t>Scan Interval</w:t>
             </w:r>
           </w:p>
@@ -825,6 +915,7 @@
         <w:tc>
           <w:tcPr>
             <w:tcW w:type="dxa" w:w="3135"/>
+            <w:shd w:fill="F2F7FB"/>
           </w:tcPr>
           <w:p>
             <w:pPr>
@@ -844,6 +935,7 @@
         <w:tc>
           <w:tcPr>
             <w:tcW w:type="dxa" w:w="3135"/>
+            <w:shd w:fill="F2F7FB"/>
           </w:tcPr>
           <w:p>
             <w:pPr>
@@ -857,6 +949,65 @@
                 <w:sz w:val="18"/>
               </w:rPr>
               <w:t>Balance API cost vs opportunity capture</w:t>
+            </w:r>
+          </w:p>
+        </w:tc>
+      </w:tr>
+      <w:tr>
+        <w:tc>
+          <w:tcPr>
+            <w:tcW w:type="dxa" w:w="3135"/>
+          </w:tcPr>
+          <w:p>
+            <w:pPr>
+              <w:jc w:val="left"/>
+            </w:pPr>
+            <w:r/>
+            <w:r>
+              <w:rPr>
+                <w:rFonts w:ascii="Garamond" w:hAnsi="Garamond"/>
+                <w:b/>
+                <w:sz w:val="18"/>
+              </w:rPr>
+              <w:t>Target Sports</w:t>
+            </w:r>
+          </w:p>
+        </w:tc>
+        <w:tc>
+          <w:tcPr>
+            <w:tcW w:type="dxa" w:w="3135"/>
+          </w:tcPr>
+          <w:p>
+            <w:pPr>
+              <w:jc w:val="center"/>
+            </w:pPr>
+            <w:r/>
+            <w:r>
+              <w:rPr>
+                <w:rFonts w:ascii="Garamond" w:hAnsi="Garamond"/>
+                <w:b w:val="0"/>
+                <w:sz w:val="18"/>
+              </w:rPr>
+              <w:t>26</w:t>
+            </w:r>
+          </w:p>
+        </w:tc>
+        <w:tc>
+          <w:tcPr>
+            <w:tcW w:type="dxa" w:w="3135"/>
+          </w:tcPr>
+          <w:p>
+            <w:pPr>
+              <w:jc w:val="left"/>
+            </w:pPr>
+            <w:r/>
+            <w:r>
+              <w:rPr>
+                <w:rFonts w:ascii="Garamond" w:hAnsi="Garamond"/>
+                <w:b w:val="0"/>
+                <w:sz w:val="18"/>
+              </w:rPr>
+              <w:t>EPL, NBA, NFL, NHL, CBB, ATP, WTA, etc.</w:t>
             </w:r>
           </w:p>
         </w:tc>
@@ -1916,7 +2067,7 @@
           <w:i w:val="0"/>
           <w:sz w:val="22"/>
         </w:rPr>
-        <w:t>The edge represents the percentage by which Polymarket underprices an outcome relative to sharp-book fair value. Filters: min 3%, max 25%, price 3-50c, exact line match for spreads/totals, max 5 days to event.</w:t>
+        <w:t>The edge represents the percentage by which Polymarket underprices an outcome relative to sharp-book fair value. Filters: min 3%, max 20%, price 5-95c, exact line match for spreads/totals (0.01 tolerance), max 10 days to event, min $100 liquidity. Exotic sub-markets (first-set, set-handicap, corners, etc.) are excluded to prevent phantom edges from cross-market-type comparison.</w:t>
       </w:r>
     </w:p>
     <w:p>
@@ -2896,7 +3047,7 @@
           <w:color w:val="2C3E50"/>
           <w:sz w:val="20"/>
         </w:rPr>
-        <w:t>size = min(f_used * bankroll, $25)</w:t>
+        <w:t>size = max($0.50, min(f_used * bankroll, $8))</w:t>
       </w:r>
     </w:p>
     <w:p>
@@ -2916,7 +3067,7 @@
           <w:rFonts w:ascii="Garamond" w:hAnsi="Garamond"/>
           <w:sz w:val="22"/>
         </w:rPr>
-        <w:t xml:space="preserve"> total_exposure / bankroll</w:t>
+        <w:t xml:space="preserve"> $400 = 80% of $500 bankroll</w:t>
       </w:r>
     </w:p>
     <w:p>
@@ -2936,7 +3087,7 @@
           <w:rFonts w:ascii="Garamond" w:hAnsi="Garamond"/>
           <w:sz w:val="22"/>
         </w:rPr>
-        <w:t xml:space="preserve"> $2 minimum (gas cost floor)</w:t>
+        <w:t xml:space="preserve"> $0.50 minimum (fractional Kelly floor)</w:t>
       </w:r>
     </w:p>
     <w:p>
@@ -2956,7 +3107,27 @@
           <w:rFonts w:ascii="Garamond" w:hAnsi="Garamond"/>
           <w:sz w:val="22"/>
         </w:rPr>
-        <w:t xml:space="preserve"> No opposing sides of same event</w:t>
+        <w:t xml:space="preserve"> No opposing sides of same event (over+under, yes+no)</w:t>
+      </w:r>
+    </w:p>
+    <w:p>
+      <w:pPr>
+        <w:pStyle w:val="ListBullet"/>
+      </w:pPr>
+      <w:r>
+        <w:rPr>
+          <w:rFonts w:ascii="Garamond" w:hAnsi="Garamond"/>
+          <w:b/>
+          <w:sz w:val="22"/>
+        </w:rPr>
+        <w:t>Duplicate check:</w:t>
+      </w:r>
+      <w:r>
+        <w:rPr>
+          <w:rFonts w:ascii="Garamond" w:hAnsi="Garamond"/>
+          <w:sz w:val="22"/>
+        </w:rPr>
+        <w:t xml:space="preserve"> No duplicate positions on same token</w:t>
       </w:r>
     </w:p>
     <w:p>
@@ -7518,6 +7689,3023 @@
           <w:sz w:val="22"/>
         </w:rPr>
         <w:t>The combination of multiple independent edge sources provides robustness: even if one source diminishes (e.g., more market makers enter Polymarket), others persist due to structural protocol constraints.</w:t>
+      </w:r>
+    </w:p>
+    <w:p>
+      <w:r>
+        <w:br w:type="page"/>
+      </w:r>
+    </w:p>
+    <w:p>
+      <w:pPr>
+        <w:pStyle w:val="Heading1"/>
+      </w:pPr>
+      <w:r>
+        <w:rPr>
+          <w:rFonts w:ascii="Garamond" w:hAnsi="Garamond"/>
+          <w:color w:val="1A3C5E"/>
+        </w:rPr>
+        <w:t>11. Market Matching Architecture</w:t>
+      </w:r>
+    </w:p>
+    <w:p>
+      <w:r>
+        <w:rPr>
+          <w:rFonts w:ascii="Garamond" w:hAnsi="Garamond"/>
+          <w:b w:val="0"/>
+          <w:i w:val="0"/>
+          <w:sz w:val="22"/>
+        </w:rPr>
+        <w:t>The matcher is the critical pipeline stage that links Polymarket slug-based markets to structured odds from The Odds API. Coverage directly determines the opportunity set.</w:t>
+      </w:r>
+    </w:p>
+    <w:p>
+      <w:pPr>
+        <w:pStyle w:val="Heading2"/>
+      </w:pPr>
+      <w:r>
+        <w:rPr>
+          <w:rFonts w:ascii="Garamond" w:hAnsi="Garamond"/>
+          <w:color w:val="1A3C5E"/>
+        </w:rPr>
+        <w:t>11.1 Matching Pipeline</w:t>
+      </w:r>
+    </w:p>
+    <w:p>
+      <w:r>
+        <w:rPr>
+          <w:rFonts w:ascii="Garamond" w:hAnsi="Garamond"/>
+          <w:b w:val="0"/>
+          <w:i w:val="0"/>
+          <w:sz w:val="22"/>
+        </w:rPr>
+        <w:t>For each Polymarket market, the matcher: (1) extracts sport, teams, and date from the slug, (2) classifies market type (h2h, spread, total, exotic), (3) finds candidate Odds API events within a 96-hour date window, (4) performs strict team name matching, (5) for spreads/totals, requires exact line match (0.01 tolerance).</w:t>
+      </w:r>
+    </w:p>
+    <w:p>
+      <w:pPr>
+        <w:pStyle w:val="Heading2"/>
+      </w:pPr>
+      <w:r>
+        <w:rPr>
+          <w:rFonts w:ascii="Garamond" w:hAnsi="Garamond"/>
+          <w:color w:val="1A3C5E"/>
+        </w:rPr>
+        <w:t>11.2 Team Name Resolution</w:t>
+      </w:r>
+    </w:p>
+    <w:tbl>
+      <w:tblPr>
+        <w:tblStyle w:val="TableGrid"/>
+        <w:tblW w:type="auto" w:w="0"/>
+        <w:jc w:val="center"/>
+        <w:tblLook w:firstColumn="1" w:firstRow="1" w:lastColumn="0" w:lastRow="0" w:noHBand="0" w:noVBand="1" w:val="04A0"/>
+      </w:tblPr>
+      <w:tblGrid>
+        <w:gridCol w:w="3135"/>
+        <w:gridCol w:w="3135"/>
+        <w:gridCol w:w="3135"/>
+      </w:tblGrid>
+      <w:tr>
+        <w:tc>
+          <w:tcPr>
+            <w:tcW w:type="dxa" w:w="3135"/>
+            <w:shd w:fill="1A3C5E"/>
+          </w:tcPr>
+          <w:p>
+            <w:pPr>
+              <w:jc w:val="center"/>
+            </w:pPr>
+            <w:r/>
+            <w:r>
+              <w:rPr>
+                <w:rFonts w:ascii="Garamond" w:hAnsi="Garamond"/>
+                <w:b/>
+                <w:color w:val="FFFFFF"/>
+                <w:sz w:val="18"/>
+              </w:rPr>
+              <w:t>Method</w:t>
+            </w:r>
+          </w:p>
+        </w:tc>
+        <w:tc>
+          <w:tcPr>
+            <w:tcW w:type="dxa" w:w="3135"/>
+            <w:shd w:fill="1A3C5E"/>
+          </w:tcPr>
+          <w:p>
+            <w:pPr>
+              <w:jc w:val="center"/>
+            </w:pPr>
+            <w:r/>
+            <w:r>
+              <w:rPr>
+                <w:rFonts w:ascii="Garamond" w:hAnsi="Garamond"/>
+                <w:b/>
+                <w:color w:val="FFFFFF"/>
+                <w:sz w:val="18"/>
+              </w:rPr>
+              <w:t>Scope</w:t>
+            </w:r>
+          </w:p>
+        </w:tc>
+        <w:tc>
+          <w:tcPr>
+            <w:tcW w:type="dxa" w:w="3135"/>
+            <w:shd w:fill="1A3C5E"/>
+          </w:tcPr>
+          <w:p>
+            <w:pPr>
+              <w:jc w:val="center"/>
+            </w:pPr>
+            <w:r/>
+            <w:r>
+              <w:rPr>
+                <w:rFonts w:ascii="Garamond" w:hAnsi="Garamond"/>
+                <w:b/>
+                <w:color w:val="FFFFFF"/>
+                <w:sz w:val="18"/>
+              </w:rPr>
+              <w:t>Example</w:t>
+            </w:r>
+          </w:p>
+        </w:tc>
+      </w:tr>
+      <w:tr>
+        <w:tc>
+          <w:tcPr>
+            <w:tcW w:type="dxa" w:w="3135"/>
+          </w:tcPr>
+          <w:p>
+            <w:pPr>
+              <w:jc w:val="left"/>
+            </w:pPr>
+            <w:r/>
+            <w:r>
+              <w:rPr>
+                <w:rFonts w:ascii="Garamond" w:hAnsi="Garamond"/>
+                <w:b/>
+                <w:sz w:val="18"/>
+              </w:rPr>
+              <w:t>TEAM_ALIASES dict</w:t>
+            </w:r>
+          </w:p>
+        </w:tc>
+        <w:tc>
+          <w:tcPr>
+            <w:tcW w:type="dxa" w:w="3135"/>
+          </w:tcPr>
+          <w:p>
+            <w:pPr>
+              <w:jc w:val="left"/>
+            </w:pPr>
+            <w:r/>
+            <w:r>
+              <w:rPr>
+                <w:rFonts w:ascii="Garamond" w:hAnsi="Garamond"/>
+                <w:b w:val="0"/>
+                <w:sz w:val="18"/>
+              </w:rPr>
+              <w:t>136 teams (NBA, NFL, EPL, etc.)</w:t>
+            </w:r>
+          </w:p>
+        </w:tc>
+        <w:tc>
+          <w:tcPr>
+            <w:tcW w:type="dxa" w:w="3135"/>
+          </w:tcPr>
+          <w:p>
+            <w:pPr>
+              <w:jc w:val="left"/>
+            </w:pPr>
+            <w:r/>
+            <w:r>
+              <w:rPr>
+                <w:rFonts w:ascii="Garamond" w:hAnsi="Garamond"/>
+                <w:b w:val="0"/>
+                <w:sz w:val="18"/>
+              </w:rPr>
+              <w:t>lakers -&gt; Los Angeles Lakers</w:t>
+            </w:r>
+          </w:p>
+        </w:tc>
+      </w:tr>
+      <w:tr>
+        <w:tc>
+          <w:tcPr>
+            <w:tcW w:type="dxa" w:w="3135"/>
+            <w:shd w:fill="F2F7FB"/>
+          </w:tcPr>
+          <w:p>
+            <w:pPr>
+              <w:jc w:val="left"/>
+            </w:pPr>
+            <w:r/>
+            <w:r>
+              <w:rPr>
+                <w:rFonts w:ascii="Garamond" w:hAnsi="Garamond"/>
+                <w:b/>
+                <w:sz w:val="18"/>
+              </w:rPr>
+              <w:t>Sport-scoped abbrevs</w:t>
+            </w:r>
+          </w:p>
+        </w:tc>
+        <w:tc>
+          <w:tcPr>
+            <w:tcW w:type="dxa" w:w="3135"/>
+            <w:shd w:fill="F2F7FB"/>
+          </w:tcPr>
+          <w:p>
+            <w:pPr>
+              <w:jc w:val="left"/>
+            </w:pPr>
+            <w:r/>
+            <w:r>
+              <w:rPr>
+                <w:rFonts w:ascii="Garamond" w:hAnsi="Garamond"/>
+                <w:b w:val="0"/>
+                <w:sz w:val="18"/>
+              </w:rPr>
+              <w:t>32 NHL + 20 CBB teams</w:t>
+            </w:r>
+          </w:p>
+        </w:tc>
+        <w:tc>
+          <w:tcPr>
+            <w:tcW w:type="dxa" w:w="3135"/>
+            <w:shd w:fill="F2F7FB"/>
+          </w:tcPr>
+          <w:p>
+            <w:pPr>
+              <w:jc w:val="left"/>
+            </w:pPr>
+            <w:r/>
+            <w:r>
+              <w:rPr>
+                <w:rFonts w:ascii="Garamond" w:hAnsi="Garamond"/>
+                <w:b w:val="0"/>
+                <w:sz w:val="18"/>
+              </w:rPr>
+              <w:t>(nhl, edm) -&gt; Edmonton Oilers</w:t>
+            </w:r>
+          </w:p>
+        </w:tc>
+      </w:tr>
+      <w:tr>
+        <w:tc>
+          <w:tcPr>
+            <w:tcW w:type="dxa" w:w="3135"/>
+          </w:tcPr>
+          <w:p>
+            <w:pPr>
+              <w:jc w:val="left"/>
+            </w:pPr>
+            <w:r/>
+            <w:r>
+              <w:rPr>
+                <w:rFonts w:ascii="Garamond" w:hAnsi="Garamond"/>
+                <w:b/>
+                <w:sz w:val="18"/>
+              </w:rPr>
+              <w:t>Tennis surname match</w:t>
+            </w:r>
+          </w:p>
+        </w:tc>
+        <w:tc>
+          <w:tcPr>
+            <w:tcW w:type="dxa" w:w="3135"/>
+          </w:tcPr>
+          <w:p>
+            <w:pPr>
+              <w:jc w:val="left"/>
+            </w:pPr>
+            <w:r/>
+            <w:r>
+              <w:rPr>
+                <w:rFonts w:ascii="Garamond" w:hAnsi="Garamond"/>
+                <w:b w:val="0"/>
+                <w:sz w:val="18"/>
+              </w:rPr>
+              <w:t>All ATP/WTA dynamically</w:t>
+            </w:r>
+          </w:p>
+        </w:tc>
+        <w:tc>
+          <w:tcPr>
+            <w:tcW w:type="dxa" w:w="3135"/>
+          </w:tcPr>
+          <w:p>
+            <w:pPr>
+              <w:jc w:val="left"/>
+            </w:pPr>
+            <w:r/>
+            <w:r>
+              <w:rPr>
+                <w:rFonts w:ascii="Garamond" w:hAnsi="Garamond"/>
+                <w:b w:val="0"/>
+                <w:sz w:val="18"/>
+              </w:rPr>
+              <w:t>slug 'djokovic' -&gt; 'Novak Djokovic'</w:t>
+            </w:r>
+          </w:p>
+        </w:tc>
+      </w:tr>
+      <w:tr>
+        <w:tc>
+          <w:tcPr>
+            <w:tcW w:type="dxa" w:w="3135"/>
+            <w:shd w:fill="F2F7FB"/>
+          </w:tcPr>
+          <w:p>
+            <w:pPr>
+              <w:jc w:val="left"/>
+            </w:pPr>
+            <w:r/>
+            <w:r>
+              <w:rPr>
+                <w:rFonts w:ascii="Garamond" w:hAnsi="Garamond"/>
+                <w:b/>
+                <w:sz w:val="18"/>
+              </w:rPr>
+              <w:t>Fuzzy matching (0.80)</w:t>
+            </w:r>
+          </w:p>
+        </w:tc>
+        <w:tc>
+          <w:tcPr>
+            <w:tcW w:type="dxa" w:w="3135"/>
+            <w:shd w:fill="F2F7FB"/>
+          </w:tcPr>
+          <w:p>
+            <w:pPr>
+              <w:jc w:val="left"/>
+            </w:pPr>
+            <w:r/>
+            <w:r>
+              <w:rPr>
+                <w:rFonts w:ascii="Garamond" w:hAnsi="Garamond"/>
+                <w:b w:val="0"/>
+                <w:sz w:val="18"/>
+              </w:rPr>
+              <w:t>Fallback for partial matches</w:t>
+            </w:r>
+          </w:p>
+        </w:tc>
+        <w:tc>
+          <w:tcPr>
+            <w:tcW w:type="dxa" w:w="3135"/>
+            <w:shd w:fill="F2F7FB"/>
+          </w:tcPr>
+          <w:p>
+            <w:pPr>
+              <w:jc w:val="left"/>
+            </w:pPr>
+            <w:r/>
+            <w:r>
+              <w:rPr>
+                <w:rFonts w:ascii="Garamond" w:hAnsi="Garamond"/>
+                <w:b w:val="0"/>
+                <w:sz w:val="18"/>
+              </w:rPr>
+              <w:t>man-utd -&gt; Manchester United</w:t>
+            </w:r>
+          </w:p>
+        </w:tc>
+      </w:tr>
+    </w:tbl>
+    <w:p/>
+    <w:p>
+      <w:pPr>
+        <w:pStyle w:val="Heading2"/>
+      </w:pPr>
+      <w:r>
+        <w:rPr>
+          <w:rFonts w:ascii="Garamond" w:hAnsi="Garamond"/>
+          <w:color w:val="1A3C5E"/>
+        </w:rPr>
+        <w:t>11.3 Exotic Market Filtering</w:t>
+      </w:r>
+    </w:p>
+    <w:p>
+      <w:r>
+        <w:rPr>
+          <w:rFonts w:ascii="Garamond" w:hAnsi="Garamond"/>
+          <w:b w:val="0"/>
+          <w:i w:val="0"/>
+          <w:sz w:val="22"/>
+        </w:rPr>
+        <w:t>Sub-markets like first-set-winner, set-handicap, set-totals, match-total, corners, and tiebreak markets are filtered BEFORE market type classification. Without this, their prices get compared to match-winner odds, creating phantom edges of 10-65%. This was a critical bug fix: the exotic check must run before spread/total detection because patterns like '-corners-over-' contain '-over-' which triggers total classification.</w:t>
+      </w:r>
+    </w:p>
+    <w:p>
+      <w:pPr>
+        <w:pStyle w:val="Heading2"/>
+      </w:pPr>
+      <w:r>
+        <w:rPr>
+          <w:rFonts w:ascii="Garamond" w:hAnsi="Garamond"/>
+          <w:color w:val="1A3C5E"/>
+        </w:rPr>
+        <w:t>11.4 Coverage Metrics</w:t>
+      </w:r>
+    </w:p>
+    <w:tbl>
+      <w:tblPr>
+        <w:tblStyle w:val="TableGrid"/>
+        <w:tblW w:type="auto" w:w="0"/>
+        <w:jc w:val="center"/>
+        <w:tblLook w:firstColumn="1" w:firstRow="1" w:lastColumn="0" w:lastRow="0" w:noHBand="0" w:noVBand="1" w:val="04A0"/>
+      </w:tblPr>
+      <w:tblGrid>
+        <w:gridCol w:w="2351"/>
+        <w:gridCol w:w="2351"/>
+        <w:gridCol w:w="2351"/>
+        <w:gridCol w:w="2351"/>
+      </w:tblGrid>
+      <w:tr>
+        <w:tc>
+          <w:tcPr>
+            <w:tcW w:type="dxa" w:w="2351"/>
+            <w:shd w:fill="1A3C5E"/>
+          </w:tcPr>
+          <w:p>
+            <w:pPr>
+              <w:jc w:val="center"/>
+            </w:pPr>
+            <w:r/>
+            <w:r>
+              <w:rPr>
+                <w:rFonts w:ascii="Garamond" w:hAnsi="Garamond"/>
+                <w:b/>
+                <w:color w:val="FFFFFF"/>
+                <w:sz w:val="18"/>
+              </w:rPr>
+              <w:t>Metric</w:t>
+            </w:r>
+          </w:p>
+        </w:tc>
+        <w:tc>
+          <w:tcPr>
+            <w:tcW w:type="dxa" w:w="2351"/>
+            <w:shd w:fill="1A3C5E"/>
+          </w:tcPr>
+          <w:p>
+            <w:pPr>
+              <w:jc w:val="center"/>
+            </w:pPr>
+            <w:r/>
+            <w:r>
+              <w:rPr>
+                <w:rFonts w:ascii="Garamond" w:hAnsi="Garamond"/>
+                <w:b/>
+                <w:color w:val="FFFFFF"/>
+                <w:sz w:val="18"/>
+              </w:rPr>
+              <w:t>Before (Mar 5)</w:t>
+            </w:r>
+          </w:p>
+        </w:tc>
+        <w:tc>
+          <w:tcPr>
+            <w:tcW w:type="dxa" w:w="2351"/>
+            <w:shd w:fill="1A3C5E"/>
+          </w:tcPr>
+          <w:p>
+            <w:pPr>
+              <w:jc w:val="center"/>
+            </w:pPr>
+            <w:r/>
+            <w:r>
+              <w:rPr>
+                <w:rFonts w:ascii="Garamond" w:hAnsi="Garamond"/>
+                <w:b/>
+                <w:color w:val="FFFFFF"/>
+                <w:sz w:val="18"/>
+              </w:rPr>
+              <w:t>After (Mar 6)</w:t>
+            </w:r>
+          </w:p>
+        </w:tc>
+        <w:tc>
+          <w:tcPr>
+            <w:tcW w:type="dxa" w:w="2351"/>
+            <w:shd w:fill="1A3C5E"/>
+          </w:tcPr>
+          <w:p>
+            <w:pPr>
+              <w:jc w:val="center"/>
+            </w:pPr>
+            <w:r/>
+            <w:r>
+              <w:rPr>
+                <w:rFonts w:ascii="Garamond" w:hAnsi="Garamond"/>
+                <w:b/>
+                <w:color w:val="FFFFFF"/>
+                <w:sz w:val="18"/>
+              </w:rPr>
+              <w:t>Improvement</w:t>
+            </w:r>
+          </w:p>
+        </w:tc>
+      </w:tr>
+      <w:tr>
+        <w:tc>
+          <w:tcPr>
+            <w:tcW w:type="dxa" w:w="2351"/>
+          </w:tcPr>
+          <w:p>
+            <w:pPr>
+              <w:jc w:val="left"/>
+            </w:pPr>
+            <w:r/>
+            <w:r>
+              <w:rPr>
+                <w:rFonts w:ascii="Garamond" w:hAnsi="Garamond"/>
+                <w:b/>
+                <w:sz w:val="18"/>
+              </w:rPr>
+              <w:t>Configured sports</w:t>
+            </w:r>
+          </w:p>
+        </w:tc>
+        <w:tc>
+          <w:tcPr>
+            <w:tcW w:type="dxa" w:w="2351"/>
+          </w:tcPr>
+          <w:p>
+            <w:pPr>
+              <w:jc w:val="center"/>
+            </w:pPr>
+            <w:r/>
+            <w:r>
+              <w:rPr>
+                <w:rFonts w:ascii="Garamond" w:hAnsi="Garamond"/>
+                <w:b w:val="0"/>
+                <w:sz w:val="18"/>
+              </w:rPr>
+              <w:t>22</w:t>
+            </w:r>
+          </w:p>
+        </w:tc>
+        <w:tc>
+          <w:tcPr>
+            <w:tcW w:type="dxa" w:w="2351"/>
+          </w:tcPr>
+          <w:p>
+            <w:pPr>
+              <w:jc w:val="center"/>
+            </w:pPr>
+            <w:r/>
+            <w:r>
+              <w:rPr>
+                <w:rFonts w:ascii="Garamond" w:hAnsi="Garamond"/>
+                <w:b w:val="0"/>
+                <w:sz w:val="18"/>
+              </w:rPr>
+              <w:t>26</w:t>
+            </w:r>
+          </w:p>
+        </w:tc>
+        <w:tc>
+          <w:tcPr>
+            <w:tcW w:type="dxa" w:w="2351"/>
+          </w:tcPr>
+          <w:p>
+            <w:pPr>
+              <w:jc w:val="center"/>
+            </w:pPr>
+            <w:r/>
+            <w:r>
+              <w:rPr>
+                <w:rFonts w:ascii="Garamond" w:hAnsi="Garamond"/>
+                <w:b w:val="0"/>
+                <w:sz w:val="18"/>
+              </w:rPr>
+              <w:t>+4 (NHL, CBB, CFB, Eredivisie)</w:t>
+            </w:r>
+          </w:p>
+        </w:tc>
+      </w:tr>
+      <w:tr>
+        <w:tc>
+          <w:tcPr>
+            <w:tcW w:type="dxa" w:w="2351"/>
+            <w:shd w:fill="F2F7FB"/>
+          </w:tcPr>
+          <w:p>
+            <w:pPr>
+              <w:jc w:val="left"/>
+            </w:pPr>
+            <w:r/>
+            <w:r>
+              <w:rPr>
+                <w:rFonts w:ascii="Garamond" w:hAnsi="Garamond"/>
+                <w:b/>
+                <w:sz w:val="18"/>
+              </w:rPr>
+              <w:t>Team aliases</w:t>
+            </w:r>
+          </w:p>
+        </w:tc>
+        <w:tc>
+          <w:tcPr>
+            <w:tcW w:type="dxa" w:w="2351"/>
+            <w:shd w:fill="F2F7FB"/>
+          </w:tcPr>
+          <w:p>
+            <w:pPr>
+              <w:jc w:val="center"/>
+            </w:pPr>
+            <w:r/>
+            <w:r>
+              <w:rPr>
+                <w:rFonts w:ascii="Garamond" w:hAnsi="Garamond"/>
+                <w:b w:val="0"/>
+                <w:sz w:val="18"/>
+              </w:rPr>
+              <w:t>136</w:t>
+            </w:r>
+          </w:p>
+        </w:tc>
+        <w:tc>
+          <w:tcPr>
+            <w:tcW w:type="dxa" w:w="2351"/>
+            <w:shd w:fill="F2F7FB"/>
+          </w:tcPr>
+          <w:p>
+            <w:pPr>
+              <w:jc w:val="center"/>
+            </w:pPr>
+            <w:r/>
+            <w:r>
+              <w:rPr>
+                <w:rFonts w:ascii="Garamond" w:hAnsi="Garamond"/>
+                <w:b w:val="0"/>
+                <w:sz w:val="18"/>
+              </w:rPr>
+              <w:t>188+</w:t>
+            </w:r>
+          </w:p>
+        </w:tc>
+        <w:tc>
+          <w:tcPr>
+            <w:tcW w:type="dxa" w:w="2351"/>
+            <w:shd w:fill="F2F7FB"/>
+          </w:tcPr>
+          <w:p>
+            <w:pPr>
+              <w:jc w:val="center"/>
+            </w:pPr>
+            <w:r/>
+            <w:r>
+              <w:rPr>
+                <w:rFonts w:ascii="Garamond" w:hAnsi="Garamond"/>
+                <w:b w:val="0"/>
+                <w:sz w:val="18"/>
+              </w:rPr>
+              <w:t>+52 NHL/CBB + dynamic tennis</w:t>
+            </w:r>
+          </w:p>
+        </w:tc>
+      </w:tr>
+      <w:tr>
+        <w:tc>
+          <w:tcPr>
+            <w:tcW w:type="dxa" w:w="2351"/>
+          </w:tcPr>
+          <w:p>
+            <w:pPr>
+              <w:jc w:val="left"/>
+            </w:pPr>
+            <w:r/>
+            <w:r>
+              <w:rPr>
+                <w:rFonts w:ascii="Garamond" w:hAnsi="Garamond"/>
+                <w:b/>
+                <w:sz w:val="18"/>
+              </w:rPr>
+              <w:t>Date match window</w:t>
+            </w:r>
+          </w:p>
+        </w:tc>
+        <w:tc>
+          <w:tcPr>
+            <w:tcW w:type="dxa" w:w="2351"/>
+          </w:tcPr>
+          <w:p>
+            <w:pPr>
+              <w:jc w:val="center"/>
+            </w:pPr>
+            <w:r/>
+            <w:r>
+              <w:rPr>
+                <w:rFonts w:ascii="Garamond" w:hAnsi="Garamond"/>
+                <w:b w:val="0"/>
+                <w:sz w:val="18"/>
+              </w:rPr>
+              <w:t>48 hours</w:t>
+            </w:r>
+          </w:p>
+        </w:tc>
+        <w:tc>
+          <w:tcPr>
+            <w:tcW w:type="dxa" w:w="2351"/>
+          </w:tcPr>
+          <w:p>
+            <w:pPr>
+              <w:jc w:val="center"/>
+            </w:pPr>
+            <w:r/>
+            <w:r>
+              <w:rPr>
+                <w:rFonts w:ascii="Garamond" w:hAnsi="Garamond"/>
+                <w:b w:val="0"/>
+                <w:sz w:val="18"/>
+              </w:rPr>
+              <w:t>96 hours</w:t>
+            </w:r>
+          </w:p>
+        </w:tc>
+        <w:tc>
+          <w:tcPr>
+            <w:tcW w:type="dxa" w:w="2351"/>
+          </w:tcPr>
+          <w:p>
+            <w:pPr>
+              <w:jc w:val="center"/>
+            </w:pPr>
+            <w:r/>
+            <w:r>
+              <w:rPr>
+                <w:rFonts w:ascii="Garamond" w:hAnsi="Garamond"/>
+                <w:b w:val="0"/>
+                <w:sz w:val="18"/>
+              </w:rPr>
+              <w:t>2x wider</w:t>
+            </w:r>
+          </w:p>
+        </w:tc>
+      </w:tr>
+      <w:tr>
+        <w:tc>
+          <w:tcPr>
+            <w:tcW w:type="dxa" w:w="2351"/>
+            <w:shd w:fill="F2F7FB"/>
+          </w:tcPr>
+          <w:p>
+            <w:pPr>
+              <w:jc w:val="left"/>
+            </w:pPr>
+            <w:r/>
+            <w:r>
+              <w:rPr>
+                <w:rFonts w:ascii="Garamond" w:hAnsi="Garamond"/>
+                <w:b/>
+                <w:sz w:val="18"/>
+              </w:rPr>
+              <w:t>Polymarket fetch limit</w:t>
+            </w:r>
+          </w:p>
+        </w:tc>
+        <w:tc>
+          <w:tcPr>
+            <w:tcW w:type="dxa" w:w="2351"/>
+            <w:shd w:fill="F2F7FB"/>
+          </w:tcPr>
+          <w:p>
+            <w:pPr>
+              <w:jc w:val="center"/>
+            </w:pPr>
+            <w:r/>
+            <w:r>
+              <w:rPr>
+                <w:rFonts w:ascii="Garamond" w:hAnsi="Garamond"/>
+                <w:b w:val="0"/>
+                <w:sz w:val="18"/>
+              </w:rPr>
+              <w:t>100/sport</w:t>
+            </w:r>
+          </w:p>
+        </w:tc>
+        <w:tc>
+          <w:tcPr>
+            <w:tcW w:type="dxa" w:w="2351"/>
+            <w:shd w:fill="F2F7FB"/>
+          </w:tcPr>
+          <w:p>
+            <w:pPr>
+              <w:jc w:val="center"/>
+            </w:pPr>
+            <w:r/>
+            <w:r>
+              <w:rPr>
+                <w:rFonts w:ascii="Garamond" w:hAnsi="Garamond"/>
+                <w:b w:val="0"/>
+                <w:sz w:val="18"/>
+              </w:rPr>
+              <w:t>200/sport</w:t>
+            </w:r>
+          </w:p>
+        </w:tc>
+        <w:tc>
+          <w:tcPr>
+            <w:tcW w:type="dxa" w:w="2351"/>
+            <w:shd w:fill="F2F7FB"/>
+          </w:tcPr>
+          <w:p>
+            <w:pPr>
+              <w:jc w:val="center"/>
+            </w:pPr>
+            <w:r/>
+            <w:r>
+              <w:rPr>
+                <w:rFonts w:ascii="Garamond" w:hAnsi="Garamond"/>
+                <w:b w:val="0"/>
+                <w:sz w:val="18"/>
+              </w:rPr>
+              <w:t>2x coverage</w:t>
+            </w:r>
+          </w:p>
+        </w:tc>
+      </w:tr>
+      <w:tr>
+        <w:tc>
+          <w:tcPr>
+            <w:tcW w:type="dxa" w:w="2351"/>
+          </w:tcPr>
+          <w:p>
+            <w:pPr>
+              <w:jc w:val="left"/>
+            </w:pPr>
+            <w:r/>
+            <w:r>
+              <w:rPr>
+                <w:rFonts w:ascii="Garamond" w:hAnsi="Garamond"/>
+                <w:b/>
+                <w:sz w:val="18"/>
+              </w:rPr>
+              <w:t>Matched markets/scan</w:t>
+            </w:r>
+          </w:p>
+        </w:tc>
+        <w:tc>
+          <w:tcPr>
+            <w:tcW w:type="dxa" w:w="2351"/>
+          </w:tcPr>
+          <w:p>
+            <w:pPr>
+              <w:jc w:val="center"/>
+            </w:pPr>
+            <w:r/>
+            <w:r>
+              <w:rPr>
+                <w:rFonts w:ascii="Garamond" w:hAnsi="Garamond"/>
+                <w:b w:val="0"/>
+                <w:sz w:val="18"/>
+              </w:rPr>
+              <w:t>44</w:t>
+            </w:r>
+          </w:p>
+        </w:tc>
+        <w:tc>
+          <w:tcPr>
+            <w:tcW w:type="dxa" w:w="2351"/>
+          </w:tcPr>
+          <w:p>
+            <w:pPr>
+              <w:jc w:val="center"/>
+            </w:pPr>
+            <w:r/>
+            <w:r>
+              <w:rPr>
+                <w:rFonts w:ascii="Garamond" w:hAnsi="Garamond"/>
+                <w:b w:val="0"/>
+                <w:sz w:val="18"/>
+              </w:rPr>
+              <w:t>96</w:t>
+            </w:r>
+          </w:p>
+        </w:tc>
+        <w:tc>
+          <w:tcPr>
+            <w:tcW w:type="dxa" w:w="2351"/>
+          </w:tcPr>
+          <w:p>
+            <w:pPr>
+              <w:jc w:val="center"/>
+            </w:pPr>
+            <w:r/>
+            <w:r>
+              <w:rPr>
+                <w:rFonts w:ascii="Garamond" w:hAnsi="Garamond"/>
+                <w:b w:val="0"/>
+                <w:sz w:val="18"/>
+              </w:rPr>
+              <w:t>+118%</w:t>
+            </w:r>
+          </w:p>
+        </w:tc>
+      </w:tr>
+      <w:tr>
+        <w:tc>
+          <w:tcPr>
+            <w:tcW w:type="dxa" w:w="2351"/>
+            <w:shd w:fill="F2F7FB"/>
+          </w:tcPr>
+          <w:p>
+            <w:pPr>
+              <w:jc w:val="left"/>
+            </w:pPr>
+            <w:r/>
+            <w:r>
+              <w:rPr>
+                <w:rFonts w:ascii="Garamond" w:hAnsi="Garamond"/>
+                <w:b/>
+                <w:sz w:val="18"/>
+              </w:rPr>
+              <w:t>Trades placed/scan</w:t>
+            </w:r>
+          </w:p>
+        </w:tc>
+        <w:tc>
+          <w:tcPr>
+            <w:tcW w:type="dxa" w:w="2351"/>
+            <w:shd w:fill="F2F7FB"/>
+          </w:tcPr>
+          <w:p>
+            <w:pPr>
+              <w:jc w:val="center"/>
+            </w:pPr>
+            <w:r/>
+            <w:r>
+              <w:rPr>
+                <w:rFonts w:ascii="Garamond" w:hAnsi="Garamond"/>
+                <w:b w:val="0"/>
+                <w:sz w:val="18"/>
+              </w:rPr>
+              <w:t>0-13</w:t>
+            </w:r>
+          </w:p>
+        </w:tc>
+        <w:tc>
+          <w:tcPr>
+            <w:tcW w:type="dxa" w:w="2351"/>
+            <w:shd w:fill="F2F7FB"/>
+          </w:tcPr>
+          <w:p>
+            <w:pPr>
+              <w:jc w:val="center"/>
+            </w:pPr>
+            <w:r/>
+            <w:r>
+              <w:rPr>
+                <w:rFonts w:ascii="Garamond" w:hAnsi="Garamond"/>
+                <w:b w:val="0"/>
+                <w:sz w:val="18"/>
+              </w:rPr>
+              <w:t>43-87</w:t>
+            </w:r>
+          </w:p>
+        </w:tc>
+        <w:tc>
+          <w:tcPr>
+            <w:tcW w:type="dxa" w:w="2351"/>
+            <w:shd w:fill="F2F7FB"/>
+          </w:tcPr>
+          <w:p>
+            <w:pPr>
+              <w:jc w:val="center"/>
+            </w:pPr>
+            <w:r/>
+            <w:r>
+              <w:rPr>
+                <w:rFonts w:ascii="Garamond" w:hAnsi="Garamond"/>
+                <w:b w:val="0"/>
+                <w:sz w:val="18"/>
+              </w:rPr>
+              <w:t>6-7x increase</w:t>
+            </w:r>
+          </w:p>
+        </w:tc>
+      </w:tr>
+    </w:tbl>
+    <w:p/>
+    <w:p>
+      <w:r>
+        <w:br w:type="page"/>
+      </w:r>
+    </w:p>
+    <w:p>
+      <w:pPr>
+        <w:pStyle w:val="Heading1"/>
+      </w:pPr>
+      <w:r>
+        <w:rPr>
+          <w:rFonts w:ascii="Garamond" w:hAnsi="Garamond"/>
+          <w:color w:val="1A3C5E"/>
+        </w:rPr>
+        <w:t>12. Paper Trading Results (March 2026)</w:t>
+      </w:r>
+    </w:p>
+    <w:p>
+      <w:pPr>
+        <w:pStyle w:val="Heading2"/>
+      </w:pPr>
+      <w:r>
+        <w:rPr>
+          <w:rFonts w:ascii="Garamond" w:hAnsi="Garamond"/>
+          <w:color w:val="1A3C5E"/>
+        </w:rPr>
+        <w:t>12.1 Phase 1: Initial Deployment (March 5)</w:t>
+      </w:r>
+    </w:p>
+    <w:p>
+      <w:r>
+        <w:rPr>
+          <w:rFonts w:ascii="Garamond" w:hAnsi="Garamond"/>
+          <w:b w:val="0"/>
+          <w:i w:val="0"/>
+          <w:sz w:val="22"/>
+        </w:rPr>
+        <w:t>Initial deployment with 22 sports, 136 team aliases, 48h date window. Matched 44 markets per scan, placed 62 positions over ~12 hours.</w:t>
+      </w:r>
+    </w:p>
+    <w:tbl>
+      <w:tblPr>
+        <w:tblStyle w:val="TableGrid"/>
+        <w:tblW w:type="auto" w:w="0"/>
+        <w:jc w:val="center"/>
+        <w:tblLook w:firstColumn="1" w:firstRow="1" w:lastColumn="0" w:lastRow="0" w:noHBand="0" w:noVBand="1" w:val="04A0"/>
+      </w:tblPr>
+      <w:tblGrid>
+        <w:gridCol w:w="4703"/>
+        <w:gridCol w:w="4703"/>
+      </w:tblGrid>
+      <w:tr>
+        <w:tc>
+          <w:tcPr>
+            <w:tcW w:type="dxa" w:w="4703"/>
+            <w:shd w:fill="1A3C5E"/>
+          </w:tcPr>
+          <w:p>
+            <w:pPr>
+              <w:jc w:val="center"/>
+            </w:pPr>
+            <w:r/>
+            <w:r>
+              <w:rPr>
+                <w:rFonts w:ascii="Garamond" w:hAnsi="Garamond"/>
+                <w:b/>
+                <w:color w:val="FFFFFF"/>
+                <w:sz w:val="18"/>
+              </w:rPr>
+              <w:t>Metric</w:t>
+            </w:r>
+          </w:p>
+        </w:tc>
+        <w:tc>
+          <w:tcPr>
+            <w:tcW w:type="dxa" w:w="4703"/>
+            <w:shd w:fill="1A3C5E"/>
+          </w:tcPr>
+          <w:p>
+            <w:pPr>
+              <w:jc w:val="center"/>
+            </w:pPr>
+            <w:r/>
+            <w:r>
+              <w:rPr>
+                <w:rFonts w:ascii="Garamond" w:hAnsi="Garamond"/>
+                <w:b/>
+                <w:color w:val="FFFFFF"/>
+                <w:sz w:val="18"/>
+              </w:rPr>
+              <w:t>Value</w:t>
+            </w:r>
+          </w:p>
+        </w:tc>
+      </w:tr>
+      <w:tr>
+        <w:tc>
+          <w:tcPr>
+            <w:tcW w:type="dxa" w:w="4703"/>
+          </w:tcPr>
+          <w:p>
+            <w:pPr>
+              <w:jc w:val="left"/>
+            </w:pPr>
+            <w:r/>
+            <w:r>
+              <w:rPr>
+                <w:rFonts w:ascii="Garamond" w:hAnsi="Garamond"/>
+                <w:b/>
+                <w:sz w:val="18"/>
+              </w:rPr>
+              <w:t>Positions opened</w:t>
+            </w:r>
+          </w:p>
+        </w:tc>
+        <w:tc>
+          <w:tcPr>
+            <w:tcW w:type="dxa" w:w="4703"/>
+          </w:tcPr>
+          <w:p>
+            <w:pPr>
+              <w:jc w:val="center"/>
+            </w:pPr>
+            <w:r/>
+            <w:r>
+              <w:rPr>
+                <w:rFonts w:ascii="Garamond" w:hAnsi="Garamond"/>
+                <w:b w:val="0"/>
+                <w:sz w:val="18"/>
+              </w:rPr>
+              <w:t>62</w:t>
+            </w:r>
+          </w:p>
+        </w:tc>
+      </w:tr>
+      <w:tr>
+        <w:tc>
+          <w:tcPr>
+            <w:tcW w:type="dxa" w:w="4703"/>
+            <w:shd w:fill="F2F7FB"/>
+          </w:tcPr>
+          <w:p>
+            <w:pPr>
+              <w:jc w:val="left"/>
+            </w:pPr>
+            <w:r/>
+            <w:r>
+              <w:rPr>
+                <w:rFonts w:ascii="Garamond" w:hAnsi="Garamond"/>
+                <w:b/>
+                <w:sz w:val="18"/>
+              </w:rPr>
+              <w:t>Resolved (NBA)</w:t>
+            </w:r>
+          </w:p>
+        </w:tc>
+        <w:tc>
+          <w:tcPr>
+            <w:tcW w:type="dxa" w:w="4703"/>
+            <w:shd w:fill="F2F7FB"/>
+          </w:tcPr>
+          <w:p>
+            <w:pPr>
+              <w:jc w:val="center"/>
+            </w:pPr>
+            <w:r/>
+            <w:r>
+              <w:rPr>
+                <w:rFonts w:ascii="Garamond" w:hAnsi="Garamond"/>
+                <w:b w:val="0"/>
+                <w:sz w:val="18"/>
+              </w:rPr>
+              <w:t>15 (7W / 8L)</w:t>
+            </w:r>
+          </w:p>
+        </w:tc>
+      </w:tr>
+      <w:tr>
+        <w:tc>
+          <w:tcPr>
+            <w:tcW w:type="dxa" w:w="4703"/>
+          </w:tcPr>
+          <w:p>
+            <w:pPr>
+              <w:jc w:val="left"/>
+            </w:pPr>
+            <w:r/>
+            <w:r>
+              <w:rPr>
+                <w:rFonts w:ascii="Garamond" w:hAnsi="Garamond"/>
+                <w:b/>
+                <w:sz w:val="18"/>
+              </w:rPr>
+              <w:t>Realized P&amp;L</w:t>
+            </w:r>
+          </w:p>
+        </w:tc>
+        <w:tc>
+          <w:tcPr>
+            <w:tcW w:type="dxa" w:w="4703"/>
+          </w:tcPr>
+          <w:p>
+            <w:pPr>
+              <w:jc w:val="center"/>
+            </w:pPr>
+            <w:r/>
+            <w:r>
+              <w:rPr>
+                <w:rFonts w:ascii="Garamond" w:hAnsi="Garamond"/>
+                <w:b w:val="0"/>
+                <w:sz w:val="18"/>
+              </w:rPr>
+              <w:t>-$15.34</w:t>
+            </w:r>
+          </w:p>
+        </w:tc>
+      </w:tr>
+      <w:tr>
+        <w:tc>
+          <w:tcPr>
+            <w:tcW w:type="dxa" w:w="4703"/>
+            <w:shd w:fill="F2F7FB"/>
+          </w:tcPr>
+          <w:p>
+            <w:pPr>
+              <w:jc w:val="left"/>
+            </w:pPr>
+            <w:r/>
+            <w:r>
+              <w:rPr>
+                <w:rFonts w:ascii="Garamond" w:hAnsi="Garamond"/>
+                <w:b/>
+                <w:sz w:val="18"/>
+              </w:rPr>
+              <w:t>Win rate</w:t>
+            </w:r>
+          </w:p>
+        </w:tc>
+        <w:tc>
+          <w:tcPr>
+            <w:tcW w:type="dxa" w:w="4703"/>
+            <w:shd w:fill="F2F7FB"/>
+          </w:tcPr>
+          <w:p>
+            <w:pPr>
+              <w:jc w:val="center"/>
+            </w:pPr>
+            <w:r/>
+            <w:r>
+              <w:rPr>
+                <w:rFonts w:ascii="Garamond" w:hAnsi="Garamond"/>
+                <w:b w:val="0"/>
+                <w:sz w:val="18"/>
+              </w:rPr>
+              <w:t>46.7% (expected ~50%)</w:t>
+            </w:r>
+          </w:p>
+        </w:tc>
+      </w:tr>
+      <w:tr>
+        <w:tc>
+          <w:tcPr>
+            <w:tcW w:type="dxa" w:w="4703"/>
+          </w:tcPr>
+          <w:p>
+            <w:pPr>
+              <w:jc w:val="left"/>
+            </w:pPr>
+            <w:r/>
+            <w:r>
+              <w:rPr>
+                <w:rFonts w:ascii="Garamond" w:hAnsi="Garamond"/>
+                <w:b/>
+                <w:sz w:val="18"/>
+              </w:rPr>
+              <w:t>Avg position size</w:t>
+            </w:r>
+          </w:p>
+        </w:tc>
+        <w:tc>
+          <w:tcPr>
+            <w:tcW w:type="dxa" w:w="4703"/>
+          </w:tcPr>
+          <w:p>
+            <w:pPr>
+              <w:jc w:val="center"/>
+            </w:pPr>
+            <w:r/>
+            <w:r>
+              <w:rPr>
+                <w:rFonts w:ascii="Garamond" w:hAnsi="Garamond"/>
+                <w:b w:val="0"/>
+                <w:sz w:val="18"/>
+              </w:rPr>
+              <w:t>$4.50</w:t>
+            </w:r>
+          </w:p>
+        </w:tc>
+      </w:tr>
+    </w:tbl>
+    <w:p/>
+    <w:p>
+      <w:r>
+        <w:rPr>
+          <w:rFonts w:ascii="Garamond" w:hAnsi="Garamond"/>
+          <w:b w:val="0"/>
+          <w:i w:val="0"/>
+          <w:sz w:val="22"/>
+        </w:rPr>
+        <w:t>Key finding: contradictory position bug caused guaranteed losses (bought both Over+Under on same game totals). Four contradictory pairs identified, contributing -$14 to losses.</w:t>
+      </w:r>
+    </w:p>
+    <w:p>
+      <w:pPr>
+        <w:pStyle w:val="Heading2"/>
+      </w:pPr>
+      <w:r>
+        <w:rPr>
+          <w:rFonts w:ascii="Garamond" w:hAnsi="Garamond"/>
+          <w:color w:val="1A3C5E"/>
+        </w:rPr>
+        <w:t>12.2 Phase 2: Expanded Coverage (March 6)</w:t>
+      </w:r>
+    </w:p>
+    <w:p>
+      <w:r>
+        <w:rPr>
+          <w:rFonts w:ascii="Garamond" w:hAnsi="Garamond"/>
+          <w:b w:val="0"/>
+          <w:i w:val="0"/>
+          <w:sz w:val="22"/>
+        </w:rPr>
+        <w:t>After recalibration: 26 sports, sport-scoped abbreviations, dynamic tennis matching, exotic market filtering, 96h date window. Matched 96 markets, placed 87 trades in 2.7 hours.</w:t>
+      </w:r>
+    </w:p>
+    <w:tbl>
+      <w:tblPr>
+        <w:tblStyle w:val="TableGrid"/>
+        <w:tblW w:type="auto" w:w="0"/>
+        <w:jc w:val="center"/>
+        <w:tblLook w:firstColumn="1" w:firstRow="1" w:lastColumn="0" w:lastRow="0" w:noHBand="0" w:noVBand="1" w:val="04A0"/>
+      </w:tblPr>
+      <w:tblGrid>
+        <w:gridCol w:w="4703"/>
+        <w:gridCol w:w="4703"/>
+      </w:tblGrid>
+      <w:tr>
+        <w:tc>
+          <w:tcPr>
+            <w:tcW w:type="dxa" w:w="4703"/>
+            <w:shd w:fill="1A3C5E"/>
+          </w:tcPr>
+          <w:p>
+            <w:pPr>
+              <w:jc w:val="center"/>
+            </w:pPr>
+            <w:r/>
+            <w:r>
+              <w:rPr>
+                <w:rFonts w:ascii="Garamond" w:hAnsi="Garamond"/>
+                <w:b/>
+                <w:color w:val="FFFFFF"/>
+                <w:sz w:val="18"/>
+              </w:rPr>
+              <w:t>Metric</w:t>
+            </w:r>
+          </w:p>
+        </w:tc>
+        <w:tc>
+          <w:tcPr>
+            <w:tcW w:type="dxa" w:w="4703"/>
+            <w:shd w:fill="1A3C5E"/>
+          </w:tcPr>
+          <w:p>
+            <w:pPr>
+              <w:jc w:val="center"/>
+            </w:pPr>
+            <w:r/>
+            <w:r>
+              <w:rPr>
+                <w:rFonts w:ascii="Garamond" w:hAnsi="Garamond"/>
+                <w:b/>
+                <w:color w:val="FFFFFF"/>
+                <w:sz w:val="18"/>
+              </w:rPr>
+              <w:t>Value</w:t>
+            </w:r>
+          </w:p>
+        </w:tc>
+      </w:tr>
+      <w:tr>
+        <w:tc>
+          <w:tcPr>
+            <w:tcW w:type="dxa" w:w="4703"/>
+          </w:tcPr>
+          <w:p>
+            <w:pPr>
+              <w:jc w:val="left"/>
+            </w:pPr>
+            <w:r/>
+            <w:r>
+              <w:rPr>
+                <w:rFonts w:ascii="Garamond" w:hAnsi="Garamond"/>
+                <w:b/>
+                <w:sz w:val="18"/>
+              </w:rPr>
+              <w:t>Positions opened</w:t>
+            </w:r>
+          </w:p>
+        </w:tc>
+        <w:tc>
+          <w:tcPr>
+            <w:tcW w:type="dxa" w:w="4703"/>
+          </w:tcPr>
+          <w:p>
+            <w:pPr>
+              <w:jc w:val="center"/>
+            </w:pPr>
+            <w:r/>
+            <w:r>
+              <w:rPr>
+                <w:rFonts w:ascii="Garamond" w:hAnsi="Garamond"/>
+                <w:b w:val="0"/>
+                <w:sz w:val="18"/>
+              </w:rPr>
+              <w:t>87 (all on Mar 6)</w:t>
+            </w:r>
+          </w:p>
+        </w:tc>
+      </w:tr>
+      <w:tr>
+        <w:tc>
+          <w:tcPr>
+            <w:tcW w:type="dxa" w:w="4703"/>
+            <w:shd w:fill="F2F7FB"/>
+          </w:tcPr>
+          <w:p>
+            <w:pPr>
+              <w:jc w:val="left"/>
+            </w:pPr>
+            <w:r/>
+            <w:r>
+              <w:rPr>
+                <w:rFonts w:ascii="Garamond" w:hAnsi="Garamond"/>
+                <w:b/>
+                <w:sz w:val="18"/>
+              </w:rPr>
+              <w:t>Sports covered</w:t>
+            </w:r>
+          </w:p>
+        </w:tc>
+        <w:tc>
+          <w:tcPr>
+            <w:tcW w:type="dxa" w:w="4703"/>
+            <w:shd w:fill="F2F7FB"/>
+          </w:tcPr>
+          <w:p>
+            <w:pPr>
+              <w:jc w:val="center"/>
+            </w:pPr>
+            <w:r/>
+            <w:r>
+              <w:rPr>
+                <w:rFonts w:ascii="Garamond" w:hAnsi="Garamond"/>
+                <w:b w:val="0"/>
+                <w:sz w:val="18"/>
+              </w:rPr>
+              <w:t>6+ (EPL, Bundesliga, La Liga, NBA, NHL, ATP, WTA)</w:t>
+            </w:r>
+          </w:p>
+        </w:tc>
+      </w:tr>
+      <w:tr>
+        <w:tc>
+          <w:tcPr>
+            <w:tcW w:type="dxa" w:w="4703"/>
+          </w:tcPr>
+          <w:p>
+            <w:pPr>
+              <w:jc w:val="left"/>
+            </w:pPr>
+            <w:r/>
+            <w:r>
+              <w:rPr>
+                <w:rFonts w:ascii="Garamond" w:hAnsi="Garamond"/>
+                <w:b/>
+                <w:sz w:val="18"/>
+              </w:rPr>
+              <w:t>Total exposure</w:t>
+            </w:r>
+          </w:p>
+        </w:tc>
+        <w:tc>
+          <w:tcPr>
+            <w:tcW w:type="dxa" w:w="4703"/>
+          </w:tcPr>
+          <w:p>
+            <w:pPr>
+              <w:jc w:val="center"/>
+            </w:pPr>
+            <w:r/>
+            <w:r>
+              <w:rPr>
+                <w:rFonts w:ascii="Garamond" w:hAnsi="Garamond"/>
+                <w:b w:val="0"/>
+                <w:sz w:val="18"/>
+              </w:rPr>
+              <w:t>$331 of $400 max (83%)</w:t>
+            </w:r>
+          </w:p>
+        </w:tc>
+      </w:tr>
+      <w:tr>
+        <w:tc>
+          <w:tcPr>
+            <w:tcW w:type="dxa" w:w="4703"/>
+            <w:shd w:fill="F2F7FB"/>
+          </w:tcPr>
+          <w:p>
+            <w:pPr>
+              <w:jc w:val="left"/>
+            </w:pPr>
+            <w:r/>
+            <w:r>
+              <w:rPr>
+                <w:rFonts w:ascii="Garamond" w:hAnsi="Garamond"/>
+                <w:b/>
+                <w:sz w:val="18"/>
+              </w:rPr>
+              <w:t>Avg position size</w:t>
+            </w:r>
+          </w:p>
+        </w:tc>
+        <w:tc>
+          <w:tcPr>
+            <w:tcW w:type="dxa" w:w="4703"/>
+            <w:shd w:fill="F2F7FB"/>
+          </w:tcPr>
+          <w:p>
+            <w:pPr>
+              <w:jc w:val="center"/>
+            </w:pPr>
+            <w:r/>
+            <w:r>
+              <w:rPr>
+                <w:rFonts w:ascii="Garamond" w:hAnsi="Garamond"/>
+                <w:b w:val="0"/>
+                <w:sz w:val="18"/>
+              </w:rPr>
+              <w:t>$3.76</w:t>
+            </w:r>
+          </w:p>
+        </w:tc>
+      </w:tr>
+      <w:tr>
+        <w:tc>
+          <w:tcPr>
+            <w:tcW w:type="dxa" w:w="4703"/>
+          </w:tcPr>
+          <w:p>
+            <w:pPr>
+              <w:jc w:val="left"/>
+            </w:pPr>
+            <w:r/>
+            <w:r>
+              <w:rPr>
+                <w:rFonts w:ascii="Garamond" w:hAnsi="Garamond"/>
+                <w:b/>
+                <w:sz w:val="18"/>
+              </w:rPr>
+              <w:t>Position range</w:t>
+            </w:r>
+          </w:p>
+        </w:tc>
+        <w:tc>
+          <w:tcPr>
+            <w:tcW w:type="dxa" w:w="4703"/>
+          </w:tcPr>
+          <w:p>
+            <w:pPr>
+              <w:jc w:val="center"/>
+            </w:pPr>
+            <w:r/>
+            <w:r>
+              <w:rPr>
+                <w:rFonts w:ascii="Garamond" w:hAnsi="Garamond"/>
+                <w:b w:val="0"/>
+                <w:sz w:val="18"/>
+              </w:rPr>
+              <w:t>$0.53 - $8.00</w:t>
+            </w:r>
+          </w:p>
+        </w:tc>
+      </w:tr>
+      <w:tr>
+        <w:tc>
+          <w:tcPr>
+            <w:tcW w:type="dxa" w:w="4703"/>
+            <w:shd w:fill="F2F7FB"/>
+          </w:tcPr>
+          <w:p>
+            <w:pPr>
+              <w:jc w:val="left"/>
+            </w:pPr>
+            <w:r/>
+            <w:r>
+              <w:rPr>
+                <w:rFonts w:ascii="Garamond" w:hAnsi="Garamond"/>
+                <w:b/>
+                <w:sz w:val="18"/>
+              </w:rPr>
+              <w:t>Avg edge at entry</w:t>
+            </w:r>
+          </w:p>
+        </w:tc>
+        <w:tc>
+          <w:tcPr>
+            <w:tcW w:type="dxa" w:w="4703"/>
+            <w:shd w:fill="F2F7FB"/>
+          </w:tcPr>
+          <w:p>
+            <w:pPr>
+              <w:jc w:val="center"/>
+            </w:pPr>
+            <w:r/>
+            <w:r>
+              <w:rPr>
+                <w:rFonts w:ascii="Garamond" w:hAnsi="Garamond"/>
+                <w:b w:val="0"/>
+                <w:sz w:val="18"/>
+              </w:rPr>
+              <w:t>~6.2%</w:t>
+            </w:r>
+          </w:p>
+        </w:tc>
+      </w:tr>
+      <w:tr>
+        <w:tc>
+          <w:tcPr>
+            <w:tcW w:type="dxa" w:w="4703"/>
+          </w:tcPr>
+          <w:p>
+            <w:pPr>
+              <w:jc w:val="left"/>
+            </w:pPr>
+            <w:r/>
+            <w:r>
+              <w:rPr>
+                <w:rFonts w:ascii="Garamond" w:hAnsi="Garamond"/>
+                <w:b/>
+                <w:sz w:val="18"/>
+              </w:rPr>
+              <w:t>Fill rate (steady state)</w:t>
+            </w:r>
+          </w:p>
+        </w:tc>
+        <w:tc>
+          <w:tcPr>
+            <w:tcW w:type="dxa" w:w="4703"/>
+          </w:tcPr>
+          <w:p>
+            <w:pPr>
+              <w:jc w:val="center"/>
+            </w:pPr>
+            <w:r/>
+            <w:r>
+              <w:rPr>
+                <w:rFonts w:ascii="Garamond" w:hAnsi="Garamond"/>
+                <w:b w:val="0"/>
+                <w:sz w:val="18"/>
+              </w:rPr>
+              <w:t>$30/hr, 13 trades/hr</w:t>
+            </w:r>
+          </w:p>
+        </w:tc>
+      </w:tr>
+      <w:tr>
+        <w:tc>
+          <w:tcPr>
+            <w:tcW w:type="dxa" w:w="4703"/>
+            <w:shd w:fill="F2F7FB"/>
+          </w:tcPr>
+          <w:p>
+            <w:pPr>
+              <w:jc w:val="left"/>
+            </w:pPr>
+            <w:r/>
+            <w:r>
+              <w:rPr>
+                <w:rFonts w:ascii="Garamond" w:hAnsi="Garamond"/>
+                <w:b/>
+                <w:sz w:val="18"/>
+              </w:rPr>
+              <w:t>Unrealized MTM P&amp;L</w:t>
+            </w:r>
+          </w:p>
+        </w:tc>
+        <w:tc>
+          <w:tcPr>
+            <w:tcW w:type="dxa" w:w="4703"/>
+            <w:shd w:fill="F2F7FB"/>
+          </w:tcPr>
+          <w:p>
+            <w:pPr>
+              <w:jc w:val="center"/>
+            </w:pPr>
+            <w:r/>
+            <w:r>
+              <w:rPr>
+                <w:rFonts w:ascii="Garamond" w:hAnsi="Garamond"/>
+                <w:b w:val="0"/>
+                <w:sz w:val="18"/>
+              </w:rPr>
+              <w:t>+$2.63 (86/87 priced)</w:t>
+            </w:r>
+          </w:p>
+        </w:tc>
+      </w:tr>
+      <w:tr>
+        <w:tc>
+          <w:tcPr>
+            <w:tcW w:type="dxa" w:w="4703"/>
+          </w:tcPr>
+          <w:p>
+            <w:pPr>
+              <w:jc w:val="left"/>
+            </w:pPr>
+            <w:r/>
+            <w:r>
+              <w:rPr>
+                <w:rFonts w:ascii="Garamond" w:hAnsi="Garamond"/>
+                <w:b/>
+                <w:sz w:val="18"/>
+              </w:rPr>
+              <w:t>Resolved trades</w:t>
+            </w:r>
+          </w:p>
+        </w:tc>
+        <w:tc>
+          <w:tcPr>
+            <w:tcW w:type="dxa" w:w="4703"/>
+          </w:tcPr>
+          <w:p>
+            <w:pPr>
+              <w:jc w:val="center"/>
+            </w:pPr>
+            <w:r/>
+            <w:r>
+              <w:rPr>
+                <w:rFonts w:ascii="Garamond" w:hAnsi="Garamond"/>
+                <w:b w:val="0"/>
+                <w:sz w:val="18"/>
+              </w:rPr>
+              <w:t>0 (events pending)</w:t>
+            </w:r>
+          </w:p>
+        </w:tc>
+      </w:tr>
+    </w:tbl>
+    <w:p/>
+    <w:p>
+      <w:pPr>
+        <w:pStyle w:val="Heading2"/>
+      </w:pPr>
+      <w:r>
+        <w:rPr>
+          <w:rFonts w:ascii="Garamond" w:hAnsi="Garamond"/>
+          <w:color w:val="1A3C5E"/>
+        </w:rPr>
+        <w:t>12.3 Bugs Found During Paper Trading</w:t>
+      </w:r>
+    </w:p>
+    <w:tbl>
+      <w:tblPr>
+        <w:tblStyle w:val="TableGrid"/>
+        <w:tblW w:type="auto" w:w="0"/>
+        <w:jc w:val="center"/>
+        <w:tblLook w:firstColumn="1" w:firstRow="1" w:lastColumn="0" w:lastRow="0" w:noHBand="0" w:noVBand="1" w:val="04A0"/>
+      </w:tblPr>
+      <w:tblGrid>
+        <w:gridCol w:w="3135"/>
+        <w:gridCol w:w="3135"/>
+        <w:gridCol w:w="3135"/>
+      </w:tblGrid>
+      <w:tr>
+        <w:tc>
+          <w:tcPr>
+            <w:tcW w:type="dxa" w:w="3135"/>
+            <w:shd w:fill="1A3C5E"/>
+          </w:tcPr>
+          <w:p>
+            <w:pPr>
+              <w:jc w:val="center"/>
+            </w:pPr>
+            <w:r/>
+            <w:r>
+              <w:rPr>
+                <w:rFonts w:ascii="Garamond" w:hAnsi="Garamond"/>
+                <w:b/>
+                <w:color w:val="FFFFFF"/>
+                <w:sz w:val="18"/>
+              </w:rPr>
+              <w:t>Bug</w:t>
+            </w:r>
+          </w:p>
+        </w:tc>
+        <w:tc>
+          <w:tcPr>
+            <w:tcW w:type="dxa" w:w="3135"/>
+            <w:shd w:fill="1A3C5E"/>
+          </w:tcPr>
+          <w:p>
+            <w:pPr>
+              <w:jc w:val="center"/>
+            </w:pPr>
+            <w:r/>
+            <w:r>
+              <w:rPr>
+                <w:rFonts w:ascii="Garamond" w:hAnsi="Garamond"/>
+                <w:b/>
+                <w:color w:val="FFFFFF"/>
+                <w:sz w:val="18"/>
+              </w:rPr>
+              <w:t>Impact</w:t>
+            </w:r>
+          </w:p>
+        </w:tc>
+        <w:tc>
+          <w:tcPr>
+            <w:tcW w:type="dxa" w:w="3135"/>
+            <w:shd w:fill="1A3C5E"/>
+          </w:tcPr>
+          <w:p>
+            <w:pPr>
+              <w:jc w:val="center"/>
+            </w:pPr>
+            <w:r/>
+            <w:r>
+              <w:rPr>
+                <w:rFonts w:ascii="Garamond" w:hAnsi="Garamond"/>
+                <w:b/>
+                <w:color w:val="FFFFFF"/>
+                <w:sz w:val="18"/>
+              </w:rPr>
+              <w:t>Fix</w:t>
+            </w:r>
+          </w:p>
+        </w:tc>
+      </w:tr>
+      <w:tr>
+        <w:tc>
+          <w:tcPr>
+            <w:tcW w:type="dxa" w:w="3135"/>
+          </w:tcPr>
+          <w:p>
+            <w:pPr>
+              <w:jc w:val="left"/>
+            </w:pPr>
+            <w:r/>
+            <w:r>
+              <w:rPr>
+                <w:rFonts w:ascii="Garamond" w:hAnsi="Garamond"/>
+                <w:b/>
+                <w:sz w:val="18"/>
+              </w:rPr>
+              <w:t>Spread/total tolerance 1.0/0.5</w:t>
+            </w:r>
+          </w:p>
+        </w:tc>
+        <w:tc>
+          <w:tcPr>
+            <w:tcW w:type="dxa" w:w="3135"/>
+          </w:tcPr>
+          <w:p>
+            <w:pPr>
+              <w:jc w:val="left"/>
+            </w:pPr>
+            <w:r/>
+            <w:r>
+              <w:rPr>
+                <w:rFonts w:ascii="Garamond" w:hAnsi="Garamond"/>
+                <w:b w:val="0"/>
+                <w:sz w:val="18"/>
+              </w:rPr>
+              <w:t>Matched wrong lines, 30-82% phantom edges</w:t>
+            </w:r>
+          </w:p>
+        </w:tc>
+        <w:tc>
+          <w:tcPr>
+            <w:tcW w:type="dxa" w:w="3135"/>
+          </w:tcPr>
+          <w:p>
+            <w:pPr>
+              <w:jc w:val="left"/>
+            </w:pPr>
+            <w:r/>
+            <w:r>
+              <w:rPr>
+                <w:rFonts w:ascii="Garamond" w:hAnsi="Garamond"/>
+                <w:b w:val="0"/>
+                <w:sz w:val="18"/>
+              </w:rPr>
+              <w:t>Changed to 0.01 (exact match)</w:t>
+            </w:r>
+          </w:p>
+        </w:tc>
+      </w:tr>
+      <w:tr>
+        <w:tc>
+          <w:tcPr>
+            <w:tcW w:type="dxa" w:w="3135"/>
+            <w:shd w:fill="F2F7FB"/>
+          </w:tcPr>
+          <w:p>
+            <w:pPr>
+              <w:jc w:val="left"/>
+            </w:pPr>
+            <w:r/>
+            <w:r>
+              <w:rPr>
+                <w:rFonts w:ascii="Garamond" w:hAnsi="Garamond"/>
+                <w:b/>
+                <w:sz w:val="18"/>
+              </w:rPr>
+              <w:t>No contradictory position check</w:t>
+            </w:r>
+          </w:p>
+        </w:tc>
+        <w:tc>
+          <w:tcPr>
+            <w:tcW w:type="dxa" w:w="3135"/>
+            <w:shd w:fill="F2F7FB"/>
+          </w:tcPr>
+          <w:p>
+            <w:pPr>
+              <w:jc w:val="left"/>
+            </w:pPr>
+            <w:r/>
+            <w:r>
+              <w:rPr>
+                <w:rFonts w:ascii="Garamond" w:hAnsi="Garamond"/>
+                <w:b w:val="0"/>
+                <w:sz w:val="18"/>
+              </w:rPr>
+              <w:t>Bought Over+Under on same game</w:t>
+            </w:r>
+          </w:p>
+        </w:tc>
+        <w:tc>
+          <w:tcPr>
+            <w:tcW w:type="dxa" w:w="3135"/>
+            <w:shd w:fill="F2F7FB"/>
+          </w:tcPr>
+          <w:p>
+            <w:pPr>
+              <w:jc w:val="left"/>
+            </w:pPr>
+            <w:r/>
+            <w:r>
+              <w:rPr>
+                <w:rFonts w:ascii="Garamond" w:hAnsi="Garamond"/>
+                <w:b w:val="0"/>
+                <w:sz w:val="18"/>
+              </w:rPr>
+              <w:t>Added _has_conflicting_position()</w:t>
+            </w:r>
+          </w:p>
+        </w:tc>
+      </w:tr>
+      <w:tr>
+        <w:tc>
+          <w:tcPr>
+            <w:tcW w:type="dxa" w:w="3135"/>
+          </w:tcPr>
+          <w:p>
+            <w:pPr>
+              <w:jc w:val="left"/>
+            </w:pPr>
+            <w:r/>
+            <w:r>
+              <w:rPr>
+                <w:rFonts w:ascii="Garamond" w:hAnsi="Garamond"/>
+                <w:b/>
+                <w:sz w:val="18"/>
+              </w:rPr>
+              <w:t>Risk manager reset on restart</w:t>
+            </w:r>
+          </w:p>
+        </w:tc>
+        <w:tc>
+          <w:tcPr>
+            <w:tcW w:type="dxa" w:w="3135"/>
+          </w:tcPr>
+          <w:p>
+            <w:pPr>
+              <w:jc w:val="left"/>
+            </w:pPr>
+            <w:r/>
+            <w:r>
+              <w:rPr>
+                <w:rFonts w:ascii="Garamond" w:hAnsi="Garamond"/>
+                <w:b w:val="0"/>
+                <w:sz w:val="18"/>
+              </w:rPr>
+              <w:t>Exceeded $300 limit, opened $694</w:t>
+            </w:r>
+          </w:p>
+        </w:tc>
+        <w:tc>
+          <w:tcPr>
+            <w:tcW w:type="dxa" w:w="3135"/>
+          </w:tcPr>
+          <w:p>
+            <w:pPr>
+              <w:jc w:val="left"/>
+            </w:pPr>
+            <w:r/>
+            <w:r>
+              <w:rPr>
+                <w:rFonts w:ascii="Garamond" w:hAnsi="Garamond"/>
+                <w:b w:val="0"/>
+                <w:sz w:val="18"/>
+              </w:rPr>
+              <w:t>Added sync_from_tracker()</w:t>
+            </w:r>
+          </w:p>
+        </w:tc>
+      </w:tr>
+      <w:tr>
+        <w:tc>
+          <w:tcPr>
+            <w:tcW w:type="dxa" w:w="3135"/>
+            <w:shd w:fill="F2F7FB"/>
+          </w:tcPr>
+          <w:p>
+            <w:pPr>
+              <w:jc w:val="left"/>
+            </w:pPr>
+            <w:r/>
+            <w:r>
+              <w:rPr>
+                <w:rFonts w:ascii="Garamond" w:hAnsi="Garamond"/>
+                <w:b/>
+                <w:sz w:val="18"/>
+              </w:rPr>
+              <w:t>Sport-agnostic abbreviations</w:t>
+            </w:r>
+          </w:p>
+        </w:tc>
+        <w:tc>
+          <w:tcPr>
+            <w:tcW w:type="dxa" w:w="3135"/>
+            <w:shd w:fill="F2F7FB"/>
+          </w:tcPr>
+          <w:p>
+            <w:pPr>
+              <w:jc w:val="left"/>
+            </w:pPr>
+            <w:r/>
+            <w:r>
+              <w:rPr>
+                <w:rFonts w:ascii="Garamond" w:hAnsi="Garamond"/>
+                <w:b w:val="0"/>
+                <w:sz w:val="18"/>
+              </w:rPr>
+              <w:t>det=Pistons/Lions/Red Wings collisions</w:t>
+            </w:r>
+          </w:p>
+        </w:tc>
+        <w:tc>
+          <w:tcPr>
+            <w:tcW w:type="dxa" w:w="3135"/>
+            <w:shd w:fill="F2F7FB"/>
+          </w:tcPr>
+          <w:p>
+            <w:pPr>
+              <w:jc w:val="left"/>
+            </w:pPr>
+            <w:r/>
+            <w:r>
+              <w:rPr>
+                <w:rFonts w:ascii="Garamond" w:hAnsi="Garamond"/>
+                <w:b w:val="0"/>
+                <w:sz w:val="18"/>
+              </w:rPr>
+              <w:t>Sport-scoped _SPORT_ABBREV dict</w:t>
+            </w:r>
+          </w:p>
+        </w:tc>
+      </w:tr>
+      <w:tr>
+        <w:tc>
+          <w:tcPr>
+            <w:tcW w:type="dxa" w:w="3135"/>
+          </w:tcPr>
+          <w:p>
+            <w:pPr>
+              <w:jc w:val="left"/>
+            </w:pPr>
+            <w:r/>
+            <w:r>
+              <w:rPr>
+                <w:rFonts w:ascii="Garamond" w:hAnsi="Garamond"/>
+                <w:b/>
+                <w:sz w:val="18"/>
+              </w:rPr>
+              <w:t>Tennis date mismatch</w:t>
+            </w:r>
+          </w:p>
+        </w:tc>
+        <w:tc>
+          <w:tcPr>
+            <w:tcW w:type="dxa" w:w="3135"/>
+          </w:tcPr>
+          <w:p>
+            <w:pPr>
+              <w:jc w:val="left"/>
+            </w:pPr>
+            <w:r/>
+            <w:r>
+              <w:rPr>
+                <w:rFonts w:ascii="Garamond" w:hAnsi="Garamond"/>
+                <w:b w:val="0"/>
+                <w:sz w:val="18"/>
+              </w:rPr>
+              <w:t>end_date=tournament end, not match date</w:t>
+            </w:r>
+          </w:p>
+        </w:tc>
+        <w:tc>
+          <w:tcPr>
+            <w:tcW w:type="dxa" w:w="3135"/>
+          </w:tcPr>
+          <w:p>
+            <w:pPr>
+              <w:jc w:val="left"/>
+            </w:pPr>
+            <w:r/>
+            <w:r>
+              <w:rPr>
+                <w:rFonts w:ascii="Garamond" w:hAnsi="Garamond"/>
+                <w:b w:val="0"/>
+                <w:sz w:val="18"/>
+              </w:rPr>
+              <w:t>Extract date from slug for tennis</w:t>
+            </w:r>
+          </w:p>
+        </w:tc>
+      </w:tr>
+      <w:tr>
+        <w:tc>
+          <w:tcPr>
+            <w:tcW w:type="dxa" w:w="3135"/>
+            <w:shd w:fill="F2F7FB"/>
+          </w:tcPr>
+          <w:p>
+            <w:pPr>
+              <w:jc w:val="left"/>
+            </w:pPr>
+            <w:r/>
+            <w:r>
+              <w:rPr>
+                <w:rFonts w:ascii="Garamond" w:hAnsi="Garamond"/>
+                <w:b/>
+                <w:sz w:val="18"/>
+              </w:rPr>
+              <w:t>Exotic markets as h2h/total</w:t>
+            </w:r>
+          </w:p>
+        </w:tc>
+        <w:tc>
+          <w:tcPr>
+            <w:tcW w:type="dxa" w:w="3135"/>
+            <w:shd w:fill="F2F7FB"/>
+          </w:tcPr>
+          <w:p>
+            <w:pPr>
+              <w:jc w:val="left"/>
+            </w:pPr>
+            <w:r/>
+            <w:r>
+              <w:rPr>
+                <w:rFonts w:ascii="Garamond" w:hAnsi="Garamond"/>
+                <w:b w:val="0"/>
+                <w:sz w:val="18"/>
+              </w:rPr>
+              <w:t>First-set-winner priced vs match odds</w:t>
+            </w:r>
+          </w:p>
+        </w:tc>
+        <w:tc>
+          <w:tcPr>
+            <w:tcW w:type="dxa" w:w="3135"/>
+            <w:shd w:fill="F2F7FB"/>
+          </w:tcPr>
+          <w:p>
+            <w:pPr>
+              <w:jc w:val="left"/>
+            </w:pPr>
+            <w:r/>
+            <w:r>
+              <w:rPr>
+                <w:rFonts w:ascii="Garamond" w:hAnsi="Garamond"/>
+                <w:b w:val="0"/>
+                <w:sz w:val="18"/>
+              </w:rPr>
+              <w:t>Exotic filter before type classification</w:t>
+            </w:r>
+          </w:p>
+        </w:tc>
+      </w:tr>
+      <w:tr>
+        <w:tc>
+          <w:tcPr>
+            <w:tcW w:type="dxa" w:w="3135"/>
+          </w:tcPr>
+          <w:p>
+            <w:pPr>
+              <w:jc w:val="left"/>
+            </w:pPr>
+            <w:r/>
+            <w:r>
+              <w:rPr>
+                <w:rFonts w:ascii="Garamond" w:hAnsi="Garamond"/>
+                <w:b/>
+                <w:sz w:val="18"/>
+              </w:rPr>
+              <w:t>Corners-over as total</w:t>
+            </w:r>
+          </w:p>
+        </w:tc>
+        <w:tc>
+          <w:tcPr>
+            <w:tcW w:type="dxa" w:w="3135"/>
+          </w:tcPr>
+          <w:p>
+            <w:pPr>
+              <w:jc w:val="left"/>
+            </w:pPr>
+            <w:r/>
+            <w:r>
+              <w:rPr>
+                <w:rFonts w:ascii="Garamond" w:hAnsi="Garamond"/>
+                <w:b w:val="0"/>
+                <w:sz w:val="18"/>
+              </w:rPr>
+              <w:t>-corners-over- matched -over- pattern</w:t>
+            </w:r>
+          </w:p>
+        </w:tc>
+        <w:tc>
+          <w:tcPr>
+            <w:tcW w:type="dxa" w:w="3135"/>
+          </w:tcPr>
+          <w:p>
+            <w:pPr>
+              <w:jc w:val="left"/>
+            </w:pPr>
+            <w:r/>
+            <w:r>
+              <w:rPr>
+                <w:rFonts w:ascii="Garamond" w:hAnsi="Garamond"/>
+                <w:b w:val="0"/>
+                <w:sz w:val="18"/>
+              </w:rPr>
+              <w:t>Moved exotic check before totals check</w:t>
+            </w:r>
+          </w:p>
+        </w:tc>
+      </w:tr>
+    </w:tbl>
+    <w:p/>
+    <w:p>
+      <w:pPr>
+        <w:pStyle w:val="Heading2"/>
+      </w:pPr>
+      <w:r>
+        <w:rPr>
+          <w:rFonts w:ascii="Garamond" w:hAnsi="Garamond"/>
+          <w:color w:val="1A3C5E"/>
+        </w:rPr>
+        <w:t>12.4 Next Steps</w:t>
+      </w:r>
+    </w:p>
+    <w:p>
+      <w:pPr>
+        <w:pStyle w:val="ListBullet"/>
+      </w:pPr>
+      <w:r>
+        <w:rPr>
+          <w:rFonts w:ascii="Garamond" w:hAnsi="Garamond"/>
+          <w:b/>
+          <w:sz w:val="22"/>
+        </w:rPr>
+        <w:t>Immediate:</w:t>
+      </w:r>
+      <w:r>
+        <w:rPr>
+          <w:rFonts w:ascii="Garamond" w:hAnsi="Garamond"/>
+          <w:sz w:val="22"/>
+        </w:rPr>
+        <w:t xml:space="preserve"> Wait for event resolutions (88 open positions)</w:t>
+      </w:r>
+    </w:p>
+    <w:p>
+      <w:pPr>
+        <w:pStyle w:val="ListBullet"/>
+      </w:pPr>
+      <w:r>
+        <w:rPr>
+          <w:rFonts w:ascii="Garamond" w:hAnsi="Garamond"/>
+          <w:b/>
+          <w:sz w:val="22"/>
+        </w:rPr>
+        <w:t>M1 (30 trades):</w:t>
+      </w:r>
+      <w:r>
+        <w:rPr>
+          <w:rFonts w:ascii="Garamond" w:hAnsi="Garamond"/>
+          <w:sz w:val="22"/>
+        </w:rPr>
+        <w:t xml:space="preserve"> Validate CLV, win rate vs expected, Brier score at n=30+</w:t>
+      </w:r>
+    </w:p>
+    <w:p>
+      <w:pPr>
+        <w:pStyle w:val="ListBullet"/>
+      </w:pPr>
+      <w:r>
+        <w:rPr>
+          <w:rFonts w:ascii="Garamond" w:hAnsi="Garamond"/>
+          <w:b/>
+          <w:sz w:val="22"/>
+        </w:rPr>
+        <w:t>M2 (100 trades):</w:t>
+      </w:r>
+      <w:r>
+        <w:rPr>
+          <w:rFonts w:ascii="Garamond" w:hAnsi="Garamond"/>
+          <w:sz w:val="22"/>
+        </w:rPr>
+        <w:t xml:space="preserve"> Binomial + t-test significance at n=100</w:t>
+      </w:r>
+    </w:p>
+    <w:p>
+      <w:pPr>
+        <w:pStyle w:val="ListBullet"/>
+      </w:pPr>
+      <w:r>
+        <w:rPr>
+          <w:rFonts w:ascii="Garamond" w:hAnsi="Garamond"/>
+          <w:b/>
+          <w:sz w:val="22"/>
+        </w:rPr>
+        <w:t>Live decision:</w:t>
+      </w:r>
+      <w:r>
+        <w:rPr>
+          <w:rFonts w:ascii="Garamond" w:hAnsi="Garamond"/>
+          <w:sz w:val="22"/>
+        </w:rPr>
+        <w:t xml:space="preserve"> If CLV &gt; +2% and flat-bet ROI &gt; +3%, transition to live ($100 wallet)</w:t>
+      </w:r>
+    </w:p>
+    <w:p>
+      <w:pPr>
+        <w:pStyle w:val="ListBullet"/>
+      </w:pPr>
+      <w:r>
+        <w:rPr>
+          <w:rFonts w:ascii="Garamond" w:hAnsi="Garamond"/>
+          <w:b/>
+          <w:sz w:val="22"/>
+        </w:rPr>
+        <w:t>Future:</w:t>
+      </w:r>
+      <w:r>
+        <w:rPr>
+          <w:rFonts w:ascii="Garamond" w:hAnsi="Garamond"/>
+          <w:sz w:val="22"/>
+        </w:rPr>
+        <w:t xml:space="preserve"> Esports coverage (PandaScore), more bookmakers, closing line capture</w:t>
+      </w:r>
+    </w:p>
+    <w:p>
+      <w:pPr>
+        <w:pStyle w:val="Heading1"/>
+      </w:pPr>
+      <w:r>
+        <w:rPr>
+          <w:rFonts w:ascii="Garamond" w:hAnsi="Garamond"/>
+          <w:color w:val="1A3C5E"/>
+        </w:rPr>
+        <w:t>13. Testing &amp; Validation Framework</w:t>
+      </w:r>
+    </w:p>
+    <w:p>
+      <w:r>
+        <w:rPr>
+          <w:rFonts w:ascii="Garamond" w:hAnsi="Garamond"/>
+          <w:b w:val="0"/>
+          <w:i w:val="0"/>
+          <w:sz w:val="22"/>
+        </w:rPr>
+        <w:t>A comprehensive testing framework validates both code correctness and trading outcome quality. 319 automated tests run in 3.7 seconds across 7 test modules.</w:t>
+      </w:r>
+    </w:p>
+    <w:p>
+      <w:pPr>
+        <w:pStyle w:val="Heading2"/>
+      </w:pPr>
+      <w:r>
+        <w:rPr>
+          <w:rFonts w:ascii="Garamond" w:hAnsi="Garamond"/>
+          <w:color w:val="1A3C5E"/>
+        </w:rPr>
+        <w:t>13.1 Unit Test Coverage</w:t>
+      </w:r>
+    </w:p>
+    <w:tbl>
+      <w:tblPr>
+        <w:tblStyle w:val="TableGrid"/>
+        <w:tblW w:type="auto" w:w="0"/>
+        <w:jc w:val="center"/>
+        <w:tblLook w:firstColumn="1" w:firstRow="1" w:lastColumn="0" w:lastRow="0" w:noHBand="0" w:noVBand="1" w:val="04A0"/>
+      </w:tblPr>
+      <w:tblGrid>
+        <w:gridCol w:w="3135"/>
+        <w:gridCol w:w="3135"/>
+        <w:gridCol w:w="3135"/>
+      </w:tblGrid>
+      <w:tr>
+        <w:tc>
+          <w:tcPr>
+            <w:tcW w:type="dxa" w:w="3135"/>
+            <w:shd w:fill="1A3C5E"/>
+          </w:tcPr>
+          <w:p>
+            <w:pPr>
+              <w:jc w:val="center"/>
+            </w:pPr>
+            <w:r/>
+            <w:r>
+              <w:rPr>
+                <w:rFonts w:ascii="Garamond" w:hAnsi="Garamond"/>
+                <w:b/>
+                <w:color w:val="FFFFFF"/>
+                <w:sz w:val="18"/>
+              </w:rPr>
+              <w:t>Module</w:t>
+            </w:r>
+          </w:p>
+        </w:tc>
+        <w:tc>
+          <w:tcPr>
+            <w:tcW w:type="dxa" w:w="3135"/>
+            <w:shd w:fill="1A3C5E"/>
+          </w:tcPr>
+          <w:p>
+            <w:pPr>
+              <w:jc w:val="center"/>
+            </w:pPr>
+            <w:r/>
+            <w:r>
+              <w:rPr>
+                <w:rFonts w:ascii="Garamond" w:hAnsi="Garamond"/>
+                <w:b/>
+                <w:color w:val="FFFFFF"/>
+                <w:sz w:val="18"/>
+              </w:rPr>
+              <w:t>Tests</w:t>
+            </w:r>
+          </w:p>
+        </w:tc>
+        <w:tc>
+          <w:tcPr>
+            <w:tcW w:type="dxa" w:w="3135"/>
+            <w:shd w:fill="1A3C5E"/>
+          </w:tcPr>
+          <w:p>
+            <w:pPr>
+              <w:jc w:val="center"/>
+            </w:pPr>
+            <w:r/>
+            <w:r>
+              <w:rPr>
+                <w:rFonts w:ascii="Garamond" w:hAnsi="Garamond"/>
+                <w:b/>
+                <w:color w:val="FFFFFF"/>
+                <w:sz w:val="18"/>
+              </w:rPr>
+              <w:t>Key Coverage</w:t>
+            </w:r>
+          </w:p>
+        </w:tc>
+      </w:tr>
+      <w:tr>
+        <w:tc>
+          <w:tcPr>
+            <w:tcW w:type="dxa" w:w="3135"/>
+          </w:tcPr>
+          <w:p>
+            <w:pPr>
+              <w:jc w:val="left"/>
+            </w:pPr>
+            <w:r/>
+            <w:r>
+              <w:rPr>
+                <w:rFonts w:ascii="Garamond" w:hAnsi="Garamond"/>
+                <w:b/>
+                <w:sz w:val="18"/>
+              </w:rPr>
+              <w:t>test_matcher.py</w:t>
+            </w:r>
+          </w:p>
+        </w:tc>
+        <w:tc>
+          <w:tcPr>
+            <w:tcW w:type="dxa" w:w="3135"/>
+          </w:tcPr>
+          <w:p>
+            <w:pPr>
+              <w:jc w:val="center"/>
+            </w:pPr>
+            <w:r/>
+            <w:r>
+              <w:rPr>
+                <w:rFonts w:ascii="Garamond" w:hAnsi="Garamond"/>
+                <w:b w:val="0"/>
+                <w:sz w:val="18"/>
+              </w:rPr>
+              <w:t>142</w:t>
+            </w:r>
+          </w:p>
+        </w:tc>
+        <w:tc>
+          <w:tcPr>
+            <w:tcW w:type="dxa" w:w="3135"/>
+          </w:tcPr>
+          <w:p>
+            <w:pPr>
+              <w:jc w:val="left"/>
+            </w:pPr>
+            <w:r/>
+            <w:r>
+              <w:rPr>
+                <w:rFonts w:ascii="Garamond" w:hAnsi="Garamond"/>
+                <w:b w:val="0"/>
+                <w:sz w:val="18"/>
+              </w:rPr>
+              <w:t>Team matching, tennis surnames, exotic filtering, dates, NHL/CBB abbrevs</w:t>
+            </w:r>
+          </w:p>
+        </w:tc>
+      </w:tr>
+      <w:tr>
+        <w:tc>
+          <w:tcPr>
+            <w:tcW w:type="dxa" w:w="3135"/>
+            <w:shd w:fill="F2F7FB"/>
+          </w:tcPr>
+          <w:p>
+            <w:pPr>
+              <w:jc w:val="left"/>
+            </w:pPr>
+            <w:r/>
+            <w:r>
+              <w:rPr>
+                <w:rFonts w:ascii="Garamond" w:hAnsi="Garamond"/>
+                <w:b/>
+                <w:sz w:val="18"/>
+              </w:rPr>
+              <w:t>test_strategy.py</w:t>
+            </w:r>
+          </w:p>
+        </w:tc>
+        <w:tc>
+          <w:tcPr>
+            <w:tcW w:type="dxa" w:w="3135"/>
+            <w:shd w:fill="F2F7FB"/>
+          </w:tcPr>
+          <w:p>
+            <w:pPr>
+              <w:jc w:val="center"/>
+            </w:pPr>
+            <w:r/>
+            <w:r>
+              <w:rPr>
+                <w:rFonts w:ascii="Garamond" w:hAnsi="Garamond"/>
+                <w:b w:val="0"/>
+                <w:sz w:val="18"/>
+              </w:rPr>
+              <w:t>24</w:t>
+            </w:r>
+          </w:p>
+        </w:tc>
+        <w:tc>
+          <w:tcPr>
+            <w:tcW w:type="dxa" w:w="3135"/>
+            <w:shd w:fill="F2F7FB"/>
+          </w:tcPr>
+          <w:p>
+            <w:pPr>
+              <w:jc w:val="left"/>
+            </w:pPr>
+            <w:r/>
+            <w:r>
+              <w:rPr>
+                <w:rFonts w:ascii="Garamond" w:hAnsi="Garamond"/>
+                <w:b w:val="0"/>
+                <w:sz w:val="18"/>
+              </w:rPr>
+              <w:t>Edge evaluation, position sizing, conflict detection, exposure limits</w:t>
+            </w:r>
+          </w:p>
+        </w:tc>
+      </w:tr>
+      <w:tr>
+        <w:tc>
+          <w:tcPr>
+            <w:tcW w:type="dxa" w:w="3135"/>
+          </w:tcPr>
+          <w:p>
+            <w:pPr>
+              <w:jc w:val="left"/>
+            </w:pPr>
+            <w:r/>
+            <w:r>
+              <w:rPr>
+                <w:rFonts w:ascii="Garamond" w:hAnsi="Garamond"/>
+                <w:b/>
+                <w:sz w:val="18"/>
+              </w:rPr>
+              <w:t>test_risk_manager.py</w:t>
+            </w:r>
+          </w:p>
+        </w:tc>
+        <w:tc>
+          <w:tcPr>
+            <w:tcW w:type="dxa" w:w="3135"/>
+          </w:tcPr>
+          <w:p>
+            <w:pPr>
+              <w:jc w:val="center"/>
+            </w:pPr>
+            <w:r/>
+            <w:r>
+              <w:rPr>
+                <w:rFonts w:ascii="Garamond" w:hAnsi="Garamond"/>
+                <w:b w:val="0"/>
+                <w:sz w:val="18"/>
+              </w:rPr>
+              <w:t>26</w:t>
+            </w:r>
+          </w:p>
+        </w:tc>
+        <w:tc>
+          <w:tcPr>
+            <w:tcW w:type="dxa" w:w="3135"/>
+          </w:tcPr>
+          <w:p>
+            <w:pPr>
+              <w:jc w:val="left"/>
+            </w:pPr>
+            <w:r/>
+            <w:r>
+              <w:rPr>
+                <w:rFonts w:ascii="Garamond" w:hAnsi="Garamond"/>
+                <w:b w:val="0"/>
+                <w:sz w:val="18"/>
+              </w:rPr>
+              <w:t>Exposure tracking, state persistence, limit enforcement</w:t>
+            </w:r>
+          </w:p>
+        </w:tc>
+      </w:tr>
+      <w:tr>
+        <w:tc>
+          <w:tcPr>
+            <w:tcW w:type="dxa" w:w="3135"/>
+            <w:shd w:fill="F2F7FB"/>
+          </w:tcPr>
+          <w:p>
+            <w:pPr>
+              <w:jc w:val="left"/>
+            </w:pPr>
+            <w:r/>
+            <w:r>
+              <w:rPr>
+                <w:rFonts w:ascii="Garamond" w:hAnsi="Garamond"/>
+                <w:b/>
+                <w:sz w:val="18"/>
+              </w:rPr>
+              <w:t>test_config.py</w:t>
+            </w:r>
+          </w:p>
+        </w:tc>
+        <w:tc>
+          <w:tcPr>
+            <w:tcW w:type="dxa" w:w="3135"/>
+            <w:shd w:fill="F2F7FB"/>
+          </w:tcPr>
+          <w:p>
+            <w:pPr>
+              <w:jc w:val="center"/>
+            </w:pPr>
+            <w:r/>
+            <w:r>
+              <w:rPr>
+                <w:rFonts w:ascii="Garamond" w:hAnsi="Garamond"/>
+                <w:b w:val="0"/>
+                <w:sz w:val="18"/>
+              </w:rPr>
+              <w:t>31</w:t>
+            </w:r>
+          </w:p>
+        </w:tc>
+        <w:tc>
+          <w:tcPr>
+            <w:tcW w:type="dxa" w:w="3135"/>
+            <w:shd w:fill="F2F7FB"/>
+          </w:tcPr>
+          <w:p>
+            <w:pPr>
+              <w:jc w:val="left"/>
+            </w:pPr>
+            <w:r/>
+            <w:r>
+              <w:rPr>
+                <w:rFonts w:ascii="Garamond" w:hAnsi="Garamond"/>
+                <w:b w:val="0"/>
+                <w:sz w:val="18"/>
+              </w:rPr>
+              <w:t>Env loading, sport config, defaults</w:t>
+            </w:r>
+          </w:p>
+        </w:tc>
+      </w:tr>
+      <w:tr>
+        <w:tc>
+          <w:tcPr>
+            <w:tcW w:type="dxa" w:w="3135"/>
+          </w:tcPr>
+          <w:p>
+            <w:pPr>
+              <w:jc w:val="left"/>
+            </w:pPr>
+            <w:r/>
+            <w:r>
+              <w:rPr>
+                <w:rFonts w:ascii="Garamond" w:hAnsi="Garamond"/>
+                <w:b/>
+                <w:sz w:val="18"/>
+              </w:rPr>
+              <w:t>test_odds_client.py</w:t>
+            </w:r>
+          </w:p>
+        </w:tc>
+        <w:tc>
+          <w:tcPr>
+            <w:tcW w:type="dxa" w:w="3135"/>
+          </w:tcPr>
+          <w:p>
+            <w:pPr>
+              <w:jc w:val="center"/>
+            </w:pPr>
+            <w:r/>
+            <w:r>
+              <w:rPr>
+                <w:rFonts w:ascii="Garamond" w:hAnsi="Garamond"/>
+                <w:b w:val="0"/>
+                <w:sz w:val="18"/>
+              </w:rPr>
+              <w:t>24</w:t>
+            </w:r>
+          </w:p>
+        </w:tc>
+        <w:tc>
+          <w:tcPr>
+            <w:tcW w:type="dxa" w:w="3135"/>
+          </w:tcPr>
+          <w:p>
+            <w:pPr>
+              <w:jc w:val="left"/>
+            </w:pPr>
+            <w:r/>
+            <w:r>
+              <w:rPr>
+                <w:rFonts w:ascii="Garamond" w:hAnsi="Garamond"/>
+                <w:b w:val="0"/>
+                <w:sz w:val="18"/>
+              </w:rPr>
+              <w:t>API mapping, sport keys, rate limiting</w:t>
+            </w:r>
+          </w:p>
+        </w:tc>
+      </w:tr>
+      <w:tr>
+        <w:tc>
+          <w:tcPr>
+            <w:tcW w:type="dxa" w:w="3135"/>
+            <w:shd w:fill="F2F7FB"/>
+          </w:tcPr>
+          <w:p>
+            <w:pPr>
+              <w:jc w:val="left"/>
+            </w:pPr>
+            <w:r/>
+            <w:r>
+              <w:rPr>
+                <w:rFonts w:ascii="Garamond" w:hAnsi="Garamond"/>
+                <w:b/>
+                <w:sz w:val="18"/>
+              </w:rPr>
+              <w:t>test_polymarket_client.py</w:t>
+            </w:r>
+          </w:p>
+        </w:tc>
+        <w:tc>
+          <w:tcPr>
+            <w:tcW w:type="dxa" w:w="3135"/>
+            <w:shd w:fill="F2F7FB"/>
+          </w:tcPr>
+          <w:p>
+            <w:pPr>
+              <w:jc w:val="center"/>
+            </w:pPr>
+            <w:r/>
+            <w:r>
+              <w:rPr>
+                <w:rFonts w:ascii="Garamond" w:hAnsi="Garamond"/>
+                <w:b w:val="0"/>
+                <w:sz w:val="18"/>
+              </w:rPr>
+              <w:t>14</w:t>
+            </w:r>
+          </w:p>
+        </w:tc>
+        <w:tc>
+          <w:tcPr>
+            <w:tcW w:type="dxa" w:w="3135"/>
+            <w:shd w:fill="F2F7FB"/>
+          </w:tcPr>
+          <w:p>
+            <w:pPr>
+              <w:jc w:val="left"/>
+            </w:pPr>
+            <w:r/>
+            <w:r>
+              <w:rPr>
+                <w:rFonts w:ascii="Garamond" w:hAnsi="Garamond"/>
+                <w:b w:val="0"/>
+                <w:sz w:val="18"/>
+              </w:rPr>
+              <w:t>Fetch limits, market parsing</w:t>
+            </w:r>
+          </w:p>
+        </w:tc>
+      </w:tr>
+      <w:tr>
+        <w:tc>
+          <w:tcPr>
+            <w:tcW w:type="dxa" w:w="3135"/>
+          </w:tcPr>
+          <w:p>
+            <w:pPr>
+              <w:jc w:val="left"/>
+            </w:pPr>
+            <w:r/>
+            <w:r>
+              <w:rPr>
+                <w:rFonts w:ascii="Garamond" w:hAnsi="Garamond"/>
+                <w:b/>
+                <w:sz w:val="18"/>
+              </w:rPr>
+              <w:t>test_trading_validation.py</w:t>
+            </w:r>
+          </w:p>
+        </w:tc>
+        <w:tc>
+          <w:tcPr>
+            <w:tcW w:type="dxa" w:w="3135"/>
+          </w:tcPr>
+          <w:p>
+            <w:pPr>
+              <w:jc w:val="center"/>
+            </w:pPr>
+            <w:r/>
+            <w:r>
+              <w:rPr>
+                <w:rFonts w:ascii="Garamond" w:hAnsi="Garamond"/>
+                <w:b w:val="0"/>
+                <w:sz w:val="18"/>
+              </w:rPr>
+              <w:t>42</w:t>
+            </w:r>
+          </w:p>
+        </w:tc>
+        <w:tc>
+          <w:tcPr>
+            <w:tcW w:type="dxa" w:w="3135"/>
+          </w:tcPr>
+          <w:p>
+            <w:pPr>
+              <w:jc w:val="left"/>
+            </w:pPr>
+            <w:r/>
+            <w:r>
+              <w:rPr>
+                <w:rFonts w:ascii="Garamond" w:hAnsi="Garamond"/>
+                <w:b w:val="0"/>
+                <w:sz w:val="18"/>
+              </w:rPr>
+              <w:t>Edge calibration, phantom detection, risk checks</w:t>
+            </w:r>
+          </w:p>
+        </w:tc>
+      </w:tr>
+      <w:tr>
+        <w:tc>
+          <w:tcPr>
+            <w:tcW w:type="dxa" w:w="3135"/>
+            <w:shd w:fill="F2F7FB"/>
+          </w:tcPr>
+          <w:p>
+            <w:pPr>
+              <w:jc w:val="left"/>
+            </w:pPr>
+            <w:r/>
+            <w:r>
+              <w:rPr>
+                <w:rFonts w:ascii="Garamond" w:hAnsi="Garamond"/>
+                <w:b/>
+                <w:sz w:val="18"/>
+              </w:rPr>
+              <w:t>Total</w:t>
+            </w:r>
+          </w:p>
+        </w:tc>
+        <w:tc>
+          <w:tcPr>
+            <w:tcW w:type="dxa" w:w="3135"/>
+            <w:shd w:fill="F2F7FB"/>
+          </w:tcPr>
+          <w:p>
+            <w:pPr>
+              <w:jc w:val="center"/>
+            </w:pPr>
+            <w:r/>
+            <w:r>
+              <w:rPr>
+                <w:rFonts w:ascii="Garamond" w:hAnsi="Garamond"/>
+                <w:b w:val="0"/>
+                <w:sz w:val="18"/>
+              </w:rPr>
+              <w:t>319</w:t>
+            </w:r>
+          </w:p>
+        </w:tc>
+        <w:tc>
+          <w:tcPr>
+            <w:tcW w:type="dxa" w:w="3135"/>
+            <w:shd w:fill="F2F7FB"/>
+          </w:tcPr>
+          <w:p>
+            <w:pPr>
+              <w:jc w:val="left"/>
+            </w:pPr>
+            <w:r/>
+            <w:r>
+              <w:rPr>
+                <w:rFonts w:ascii="Garamond" w:hAnsi="Garamond"/>
+                <w:b w:val="0"/>
+                <w:sz w:val="18"/>
+              </w:rPr>
+              <w:t>3.7s execution time</w:t>
+            </w:r>
+          </w:p>
+        </w:tc>
+      </w:tr>
+    </w:tbl>
+    <w:p/>
+    <w:p>
+      <w:pPr>
+        <w:pStyle w:val="Heading2"/>
+      </w:pPr>
+      <w:r>
+        <w:rPr>
+          <w:rFonts w:ascii="Garamond" w:hAnsi="Garamond"/>
+          <w:color w:val="1A3C5E"/>
+        </w:rPr>
+        <w:t>13.2 Trade Validator (Live Monitoring)</w:t>
+      </w:r>
+    </w:p>
+    <w:p>
+      <w:r>
+        <w:rPr>
+          <w:rFonts w:ascii="Garamond" w:hAnsi="Garamond"/>
+          <w:b w:val="0"/>
+          <w:i w:val="0"/>
+          <w:sz w:val="22"/>
+        </w:rPr>
+        <w:t>The trade_validator.py module runs against live paper trading data to detect: (1) phantom edges from matching errors (exotic slug patterns, short tennis names), (2) risk limit violations (position size, exposure, contradictory positions), (3) edge calibration (Brier score, edge-bucket win rates), (4) capital efficiency (days to resolution, stale positions).</w:t>
+      </w:r>
+    </w:p>
+    <w:p>
+      <w:r>
+        <w:rPr>
+          <w:rFonts w:ascii="Garamond" w:hAnsi="Garamond"/>
+          <w:b w:val="0"/>
+          <w:i w:val="0"/>
+          <w:sz w:val="22"/>
+        </w:rPr>
+        <w:t>Critical alerts are raised when: edge calibration shows systematic overestimation, phantom slug patterns account for &gt;10% of exposure, or risk limits are breached.</w:t>
       </w:r>
     </w:p>
     <w:p>

</xml_diff>

<commit_message>
Fix deprecated/stale info in research paper
- RN1 trades full 0-100c range (was: "80%+ in 5-40c" — incorrect)
- Kelly fraction: 0.15 (15%), not 0.25 (quarter) — updated title,
  table, body text, and Section 9 reference
- Risk guardrails: exposure target 80% (was 60%), position limit
  1.6%/$8 (was 5%/$25) to match current config
- FLB magnitude: 3-20% (was "5-25% at 5-20c")
- Open positions count: 87 (was 88)

Co-Authored-By: Claude Opus 4.6 <noreply@anthropic.com>
</commit_message>
<xml_diff>
--- a/docs/Trading_Logic_and_Edge_Framework.docx
+++ b/docs/Trading_Logic_and_Edge_Framework.docx
@@ -1449,7 +1449,7 @@
           <w:i w:val="0"/>
           <w:sz w:val="22"/>
         </w:rPr>
-        <w:t>Prediction markets exhibit the well-documented FLB: longshots are overpriced relative to their true probability, and favourites are underpriced. On Polymarket, this manifests as tokens priced 5-40c trading above fair value. RN1 (the reference trader, +$20.35M verified P&amp;L) concentrated 80%+ of volume in the 5-40c range, confirming this is where mispricing is largest.</w:t>
+        <w:t>Prediction markets exhibit the well-documented FLB: longshots are overpriced relative to their true probability, and favourites are underpriced. On Polymarket, this manifests as tokens across the full price range trading above or below fair value. RN1 (the reference trader, +$20.35M verified P&amp;L over 1.1M trades) trades the full 0-100c range (median entry 0.48), suggesting mispricing exists at all price levels, not just in longshots.</w:t>
       </w:r>
     </w:p>
     <w:p>
@@ -2614,7 +2614,7 @@
           <w:rFonts w:ascii="Garamond" w:hAnsi="Garamond"/>
           <w:color w:val="1A3C5E"/>
         </w:rPr>
-        <w:t>5.2 Quarter-Kelly Rationale</w:t>
+        <w:t>5.2 Fractional Kelly Rationale</w:t>
       </w:r>
     </w:p>
     <w:p>
@@ -2625,7 +2625,7 @@
           <w:i w:val="0"/>
           <w:sz w:val="22"/>
         </w:rPr>
-        <w:t>Full Kelly is optimal only with perfect probability estimates and infinite horizon. In practice, estimation error makes it dangerously aggressive.</w:t>
+        <w:t>Full Kelly is optimal only with perfect probability estimates and infinite horizon. In practice, estimation error makes it dangerously aggressive. We use 15% Kelly (f = 0.15 * f*) during the paper trading / statistical learning phase.</w:t>
       </w:r>
     </w:p>
     <w:tbl>
@@ -2965,6 +2965,88 @@
           </w:p>
         </w:tc>
       </w:tr>
+      <w:tr>
+        <w:tc>
+          <w:tcPr>
+            <w:tcW w:type="dxa" w:w="2351"/>
+            <w:shd w:fill="F2F7FB"/>
+          </w:tcPr>
+          <w:p>
+            <w:pPr>
+              <w:jc w:val="left"/>
+            </w:pPr>
+            <w:r/>
+            <w:r>
+              <w:rPr>
+                <w:rFonts w:ascii="Garamond" w:hAnsi="Garamond"/>
+                <w:b/>
+                <w:sz w:val="18"/>
+              </w:rPr>
+              <w:t>15% (0.15) [current]</w:t>
+            </w:r>
+          </w:p>
+        </w:tc>
+        <w:tc>
+          <w:tcPr>
+            <w:tcW w:type="dxa" w:w="2351"/>
+            <w:shd w:fill="F2F7FB"/>
+          </w:tcPr>
+          <w:p>
+            <w:pPr>
+              <w:jc w:val="center"/>
+            </w:pPr>
+            <w:r/>
+            <w:r>
+              <w:rPr>
+                <w:rFonts w:ascii="Garamond" w:hAnsi="Garamond"/>
+                <w:b w:val="0"/>
+                <w:sz w:val="18"/>
+              </w:rPr>
+              <w:t>~40%</w:t>
+            </w:r>
+          </w:p>
+        </w:tc>
+        <w:tc>
+          <w:tcPr>
+            <w:tcW w:type="dxa" w:w="2351"/>
+            <w:shd w:fill="F2F7FB"/>
+          </w:tcPr>
+          <w:p>
+            <w:pPr>
+              <w:jc w:val="center"/>
+            </w:pPr>
+            <w:r/>
+            <w:r>
+              <w:rPr>
+                <w:rFonts w:ascii="Garamond" w:hAnsi="Garamond"/>
+                <w:b w:val="0"/>
+                <w:sz w:val="18"/>
+              </w:rPr>
+              <w:t>~15%</w:t>
+            </w:r>
+          </w:p>
+        </w:tc>
+        <w:tc>
+          <w:tcPr>
+            <w:tcW w:type="dxa" w:w="2351"/>
+            <w:shd w:fill="F2F7FB"/>
+          </w:tcPr>
+          <w:p>
+            <w:pPr>
+              <w:jc w:val="center"/>
+            </w:pPr>
+            <w:r/>
+            <w:r>
+              <w:rPr>
+                <w:rFonts w:ascii="Garamond" w:hAnsi="Garamond"/>
+                <w:b w:val="0"/>
+                <w:sz w:val="18"/>
+              </w:rPr>
+              <w:t>Near zero</w:t>
+            </w:r>
+          </w:p>
+        </w:tc>
+      </w:tr>
     </w:tbl>
     <w:p/>
     <w:p>
@@ -2975,7 +3057,7 @@
           <w:i w:val="0"/>
           <w:sz w:val="22"/>
         </w:rPr>
-        <w:t>Quarter-Kelly sacrifices 44% of theoretical growth but reduces variance by 75%, providing a smooth equity curve and negligible risk of ruin.</w:t>
+        <w:t>At 15% Kelly, position sizes are very small ($0.50-$8.00) which prioritises maximising trade count for statistical learning over capital growth. Once edge is confirmed (M2 milestone, n&gt;=100), Kelly fraction can be increased to 0.25.</w:t>
       </w:r>
     </w:p>
     <w:p>
@@ -4019,7 +4101,7 @@
           <w:i w:val="0"/>
           <w:sz w:val="22"/>
         </w:rPr>
-        <w:t>The following metrics define the scorecard against which live agent trading performance should be evaluated. Thresholds are calibrated for a $500 test wallet with quarter-Kelly sizing.</w:t>
+        <w:t>The following metrics define the scorecard against which live agent trading performance should be evaluated. Thresholds are calibrated for a $500 test wallet with 15% fractional Kelly sizing.</w:t>
       </w:r>
     </w:p>
     <w:p>
@@ -5049,7 +5131,7 @@
                 <w:b w:val="0"/>
                 <w:sz w:val="18"/>
               </w:rPr>
-              <w:t>&lt; 60%</w:t>
+              <w:t>&lt; 80%</w:t>
             </w:r>
           </w:p>
         </w:tc>
@@ -5069,7 +5151,7 @@
                 <w:b w:val="0"/>
                 <w:sz w:val="18"/>
               </w:rPr>
-              <w:t>80%</w:t>
+              <w:t>90%</w:t>
             </w:r>
           </w:p>
         </w:tc>
@@ -5129,7 +5211,7 @@
                 <w:b w:val="0"/>
                 <w:sz w:val="18"/>
               </w:rPr>
-              <w:t>&lt; 5%</w:t>
+              <w:t>&lt; 1.6% ($8)</w:t>
             </w:r>
           </w:p>
         </w:tc>
@@ -5148,7 +5230,7 @@
                 <w:b w:val="0"/>
                 <w:sz w:val="18"/>
               </w:rPr>
-              <w:t>10%</w:t>
+              <w:t>3% ($15)</w:t>
             </w:r>
           </w:p>
         </w:tc>
@@ -7333,7 +7415,7 @@
                 <w:b w:val="0"/>
                 <w:sz w:val="18"/>
               </w:rPr>
-              <w:t>5-25% at 5-20c</w:t>
+              <w:t>3-20%</w:t>
             </w:r>
           </w:p>
         </w:tc>
@@ -9993,7 +10075,7 @@
           <w:rFonts w:ascii="Garamond" w:hAnsi="Garamond"/>
           <w:sz w:val="22"/>
         </w:rPr>
-        <w:t xml:space="preserve"> Wait for event resolutions (88 open positions)</w:t>
+        <w:t xml:space="preserve"> Wait for event resolutions (87 open positions)</w:t>
       </w:r>
     </w:p>
     <w:p>

</xml_diff>

<commit_message>
Add $1K min volume filter, volume-weighted sorting, and slippage tracking
- Reject markets with <$1K 24h volume to avoid market impact
- Sort by edge then volume (prefer liquid markets) then RN1 score
- Pre-trade slippage: fetch best ask, compute bps vs expected price
- Live slippage: capture fill price, log actual vs expected slippage
- Research paper: add min volume param, slippage section (5.5)
- Fix config test for min_edge 3.0% (was 1.5%)
- 321 tests passing

Co-Authored-By: Claude Opus 4.6 <noreply@anthropic.com>
</commit_message>
<xml_diff>
--- a/docs/Trading_Logic_and_Edge_Framework.docx
+++ b/docs/Trading_Logic_and_Edge_Framework.docx
@@ -908,7 +908,7 @@
                 <w:b/>
                 <w:sz w:val="18"/>
               </w:rPr>
-              <w:t>Scan Interval</w:t>
+              <w:t>Min 24h Volume</w:t>
             </w:r>
           </w:p>
         </w:tc>
@@ -928,7 +928,7 @@
                 <w:b w:val="0"/>
                 <w:sz w:val="18"/>
               </w:rPr>
-              <w:t>300 seconds</w:t>
+              <w:t>$1,000</w:t>
             </w:r>
           </w:p>
         </w:tc>
@@ -948,7 +948,7 @@
                 <w:b w:val="0"/>
                 <w:sz w:val="18"/>
               </w:rPr>
-              <w:t>Balance API cost vs opportunity capture</w:t>
+              <w:t>Avoid moving illiquid markets; prefer high volume</w:t>
             </w:r>
           </w:p>
         </w:tc>
@@ -969,6 +969,66 @@
                 <w:b/>
                 <w:sz w:val="18"/>
               </w:rPr>
+              <w:t>Scan Interval</w:t>
+            </w:r>
+          </w:p>
+        </w:tc>
+        <w:tc>
+          <w:tcPr>
+            <w:tcW w:type="dxa" w:w="3135"/>
+          </w:tcPr>
+          <w:p>
+            <w:pPr>
+              <w:jc w:val="center"/>
+            </w:pPr>
+            <w:r/>
+            <w:r>
+              <w:rPr>
+                <w:rFonts w:ascii="Garamond" w:hAnsi="Garamond"/>
+                <w:b w:val="0"/>
+                <w:sz w:val="18"/>
+              </w:rPr>
+              <w:t>300 seconds</w:t>
+            </w:r>
+          </w:p>
+        </w:tc>
+        <w:tc>
+          <w:tcPr>
+            <w:tcW w:type="dxa" w:w="3135"/>
+          </w:tcPr>
+          <w:p>
+            <w:pPr>
+              <w:jc w:val="left"/>
+            </w:pPr>
+            <w:r/>
+            <w:r>
+              <w:rPr>
+                <w:rFonts w:ascii="Garamond" w:hAnsi="Garamond"/>
+                <w:b w:val="0"/>
+                <w:sz w:val="18"/>
+              </w:rPr>
+              <w:t>Balance API cost vs opportunity capture</w:t>
+            </w:r>
+          </w:p>
+        </w:tc>
+      </w:tr>
+      <w:tr>
+        <w:tc>
+          <w:tcPr>
+            <w:tcW w:type="dxa" w:w="3135"/>
+            <w:shd w:fill="F2F7FB"/>
+          </w:tcPr>
+          <w:p>
+            <w:pPr>
+              <w:jc w:val="left"/>
+            </w:pPr>
+            <w:r/>
+            <w:r>
+              <w:rPr>
+                <w:rFonts w:ascii="Garamond" w:hAnsi="Garamond"/>
+                <w:b/>
+                <w:sz w:val="18"/>
+              </w:rPr>
               <w:t>Target Sports</w:t>
             </w:r>
           </w:p>
@@ -976,6 +1036,7 @@
         <w:tc>
           <w:tcPr>
             <w:tcW w:type="dxa" w:w="3135"/>
+            <w:shd w:fill="F2F7FB"/>
           </w:tcPr>
           <w:p>
             <w:pPr>
@@ -995,6 +1056,7 @@
         <w:tc>
           <w:tcPr>
             <w:tcW w:type="dxa" w:w="3135"/>
+            <w:shd w:fill="F2F7FB"/>
           </w:tcPr>
           <w:p>
             <w:pPr>
@@ -2067,7 +2129,7 @@
           <w:i w:val="0"/>
           <w:sz w:val="22"/>
         </w:rPr>
-        <w:t>The edge represents the percentage by which Polymarket underprices an outcome relative to sharp-book fair value. Filters: min 3%, max 20%, price 5-95c, exact line match for spreads/totals (0.01 tolerance), max 10 days to event, min $100 liquidity. Exotic sub-markets (first-set, set-handicap, corners, etc.) are excluded to prevent phantom edges from cross-market-type comparison.</w:t>
+        <w:t>The edge represents the percentage by which Polymarket underprices an outcome relative to sharp-book fair value. Filters: min 3%, max 20%, price 5-95c, exact line match for spreads/totals (0.01 tolerance), max 10 days to event, min $100 liquidity, min $1,000 24h volume. Markets are sorted by edge first, then by volume (higher volume preferred) to prioritise liquid markets. Exotic sub-markets (first-set, set-handicap, corners, etc.) are excluded to prevent phantom edges from cross-market-type comparison.</w:t>
       </w:r>
     </w:p>
     <w:p>
@@ -3230,6 +3292,53 @@
           <w:sz w:val="22"/>
         </w:rPr>
         <w:t xml:space="preserve"> effective_bankroll = initial + realized_pnl</w:t>
+      </w:r>
+    </w:p>
+    <w:p>
+      <w:pPr>
+        <w:pStyle w:val="Heading2"/>
+      </w:pPr>
+      <w:r>
+        <w:rPr>
+          <w:rFonts w:ascii="Garamond" w:hAnsi="Garamond"/>
+          <w:color w:val="1A3C5E"/>
+        </w:rPr>
+        <w:t>5.5 Slippage Estimation &amp; Tracking</w:t>
+      </w:r>
+    </w:p>
+    <w:p>
+      <w:r>
+        <w:rPr>
+          <w:rFonts w:ascii="Garamond" w:hAnsi="Garamond"/>
+          <w:b w:val="0"/>
+          <w:i w:val="0"/>
+          <w:sz w:val="22"/>
+        </w:rPr>
+        <w:t>Before each order, the system fetches the current best ask price from the Polymarket orderbook and computes expected slippage in basis points:</w:t>
+      </w:r>
+    </w:p>
+    <w:p>
+      <w:pPr>
+        <w:ind w:left="850"/>
+      </w:pPr>
+      <w:r>
+        <w:rPr>
+          <w:rFonts w:ascii="Consolas" w:hAnsi="Consolas"/>
+          <w:color w:val="2C3E50"/>
+          <w:sz w:val="20"/>
+        </w:rPr>
+        <w:t>slippage_bps = (best_ask - expected_price) / expected_price * 10,000</w:t>
+      </w:r>
+    </w:p>
+    <w:p>
+      <w:r>
+        <w:rPr>
+          <w:rFonts w:ascii="Garamond" w:hAnsi="Garamond"/>
+          <w:b w:val="0"/>
+          <w:i w:val="0"/>
+          <w:sz w:val="22"/>
+        </w:rPr>
+        <w:t>In live mode, the actual fill price is captured from the order result and compared to the expected price to compute realised slippage. Both pre-trade and post-trade slippage are logged per trade for ongoing monitoring. Markets with &lt;$1,000 24h volume are excluded entirely to minimise market impact.</w:t>
       </w:r>
     </w:p>
     <w:p>

</xml_diff>